<commit_message>
Update documentation with SSL, system tray, and Clear All Records sections
Co-Authored-By: Claude Sonnet 4.6 <noreply@anthropic.com>
</commit_message>
<xml_diff>
--- a/AssetManager_Technical_Documentation.docx
+++ b/AssetManager_Technical_Documentation.docx
@@ -65,7 +65,7 @@
           <w:color w:val="555555"/>
           <w:sz w:val="28"/>
         </w:rPr>
-        <w:t>IT Department  .  Your Organization</w:t>
+        <w:t xml:space="preserve">IT Department  .  </w:t>
       </w:r>
     </w:p>
     <w:p>
@@ -5178,7 +5178,7 @@
                 <w:color w:val="111111"/>
                 <w:sz w:val="20"/>
               </w:rPr>
-              <w:t>Check the server is running on asset-server. Check the server URL in the app's Settings.</w:t>
+              <w:t xml:space="preserve">Check the server is running on asset-server. Check the server URL in the app's </w:t>
             </w:r>
             <w:r>
               <w:rPr>
@@ -5188,6 +5188,7 @@
                 <w:color w:val="111111"/>
                 <w:sz w:val="20"/>
               </w:rPr>
+              <w:t>Settings</w:t>
             </w:r>
             <w:r>
               <w:rPr>
@@ -5197,6 +5198,7 @@
                 <w:color w:val="111111"/>
                 <w:sz w:val="20"/>
               </w:rPr>
+              <w:t>.</w:t>
             </w:r>
           </w:p>
         </w:tc>
@@ -5835,8 +5837,6 @@
         <w:sz w:val="18"/>
       </w:rPr>
       <w:t>AssetManager - System Guide</w:t>
-      <w:tab/>
-      <w:t>IT Department  |  Your Organization</w:t>
     </w:r>
     <w:r>
       <w:rPr>
@@ -5846,6 +5846,8 @@
         <w:color w:val="888888"/>
         <w:sz w:val="18"/>
       </w:rPr>
+      <w:tab/>
+      <w:t xml:space="preserve">IT Department  |  </w:t>
     </w:r>
   </w:p>
 </w:hdr>

</xml_diff>

<commit_message>
Add Notifier autostart, fix docs and stale facts
- notifier_app.py: register HKCU Run key on every launch
- installer.py: write HKCU Run key at Notifier install time
- Technical doc: port 80 -> 8081, update Server troubleshooting row
- Presentation: port 80 -> 8081 on Slide 8

Co-Authored-By: Claude Sonnet 4.6 <noreply@anthropic.com>
</commit_message>
<xml_diff>
--- a/AssetManager_Technical_Documentation.docx
+++ b/AssetManager_Technical_Documentation.docx
@@ -3809,7 +3809,7 @@
           <w:color w:val="111111"/>
           <w:sz w:val="22"/>
         </w:rPr>
-        <w:t>If another system needs to connect to AssetManager, it can use these addresses. All requests go to the server's IP address on port 80.</w:t>
+        <w:t>If another system needs to connect to AssetManager, it can use these addresses. All requests go to the server's IP address on port 8081.</w:t>
       </w:r>
     </w:p>
     <w:p>
@@ -5207,27 +5207,7 @@
                 <w:color w:val="111111"/>
                 <w:sz w:val="20"/>
               </w:rPr>
-              <w:t xml:space="preserve">Make sure you right-clicked and chose </w:t>
-            </w:r>
-            <w:r>
-              <w:rPr>
-                <w:rFonts w:ascii="Arial" w:hAnsi="Arial"/>
-                <w:b/>
-                <w:i w:val="0"/>
-                <w:color w:val="111111"/>
-                <w:sz w:val="20"/>
-              </w:rPr>
-              <w:t>Run as Administrator</w:t>
-            </w:r>
-            <w:r>
-              <w:rPr>
-                <w:rFonts w:ascii="Arial" w:hAnsi="Arial"/>
-                <w:b w:val="0"/>
-                <w:i w:val="0"/>
-                <w:color w:val="111111"/>
-                <w:sz w:val="20"/>
-              </w:rPr>
-              <w:t>.</w:t>
+              <w:t>Open Services (services.msc) and start the AssetManagerServer service. If missing, run the installer again to reinstall.</w:t>
             </w:r>
           </w:p>
         </w:tc>
@@ -5350,7 +5330,7 @@
                 <w:color w:val="111111"/>
                 <w:sz w:val="20"/>
               </w:rPr>
-              <w:t>Port 80 is already in use</w:t>
+              <w:t>Port 8081 is already in use</w:t>
             </w:r>
           </w:p>
         </w:tc>
@@ -5383,7 +5363,7 @@
                 <w:color w:val="111111"/>
                 <w:sz w:val="20"/>
               </w:rPr>
-              <w:t xml:space="preserve">Another program is using port 80. Use the </w:t>
+              <w:t xml:space="preserve">Another program is using port 8081. Use the </w:t>
             </w:r>
             <w:r>
               <w:rPr>
@@ -5403,7 +5383,7 @@
                 <w:color w:val="111111"/>
                 <w:sz w:val="20"/>
               </w:rPr>
-              <w:t xml:space="preserve"> button to switch to another port (e.g., 8080).</w:t>
+              <w:t xml:space="preserve"> button to switch to another port (e.g., 8082).</w:t>
             </w:r>
           </w:p>
         </w:tc>

</xml_diff>

<commit_message>
Docs: remove empty screenshot placeholders; redact corporate data from embedded screenshots (names/host/IP -> generic). -- Co-Authored-By: Claude Opus 4.8 <noreply@anthropic.com>
</commit_message>
<xml_diff>
--- a/AssetManager_Technical_Documentation.docx
+++ b/AssetManager_Technical_Documentation.docx
@@ -1047,71 +1047,6 @@
         <w:spacing w:before="120" w:after="0"/>
       </w:pPr>
     </w:p>
-    <w:tbl>
-      <w:tblPr>
-        <w:tblW w:w="9026" w:type="dxa"/>
-        <w:tblLook w:firstColumn="1" w:firstRow="1" w:lastColumn="0" w:lastRow="0" w:noHBand="0" w:noVBand="1" w:val="04A0"/>
-      </w:tblPr>
-      <w:tblGrid>
-        <w:gridCol w:w="9026"/>
-      </w:tblGrid>
-      <w:tr>
-        <w:trPr>
-          <w:trHeight w:val="1985" w:hRule="atLeast"/>
-        </w:trPr>
-        <w:tc>
-          <w:tcPr>
-            <w:tcW w:w="9026" w:type="dxa"/>
-            <w:tcBorders>
-              <w:top w:val="single" w:sz="4" w:space="0" w:color="CCCCCC"/>
-              <w:start w:val="single" w:sz="4" w:space="0" w:color="CCCCCC"/>
-              <w:bottom w:val="single" w:sz="4" w:space="0" w:color="CCCCCC"/>
-              <w:end w:val="single" w:sz="4" w:space="0" w:color="CCCCCC"/>
-            </w:tcBorders>
-            <w:shd w:val="clear" w:color="auto" w:fill="F2F2F2"/>
-            <w:tcMar>
-              <w:top w:w="160" w:type="dxa"/>
-              <w:start w:w="240" w:type="dxa"/>
-              <w:bottom w:w="160" w:type="dxa"/>
-              <w:end w:w="240" w:type="dxa"/>
-            </w:tcMar>
-            <w:vAlign w:val="center"/>
-          </w:tcPr>
-          <w:p>
-            <w:pPr>
-              <w:spacing w:before="0" w:after="40"/>
-              <w:jc w:val="center"/>
-            </w:pPr>
-            <w:r>
-              <w:rPr>
-                <w:rFonts w:ascii="Arial" w:hAnsi="Arial"/>
-                <w:b w:val="0"/>
-                <w:i/>
-                <w:color w:val="AAAAAA"/>
-                <w:sz w:val="20"/>
-              </w:rPr>
-              <w:t>[ Screenshot -- Add here ]</w:t>
-            </w:r>
-          </w:p>
-          <w:p>
-            <w:pPr>
-              <w:spacing w:before="0" w:after="0"/>
-              <w:jc w:val="center"/>
-            </w:pPr>
-            <w:r>
-              <w:rPr>
-                <w:rFonts w:ascii="Arial" w:hAnsi="Arial"/>
-                <w:b w:val="0"/>
-                <w:i/>
-                <w:color w:val="BBBBBB"/>
-                <w:sz w:val="18"/>
-              </w:rPr>
-              <w:t>Server app running</w:t>
-            </w:r>
-          </w:p>
-        </w:tc>
-      </w:tr>
-    </w:tbl>
     <w:p>
       <w:pPr>
         <w:spacing w:before="120" w:after="0"/>
@@ -1921,71 +1856,6 @@
         <w:spacing w:before="120" w:after="0"/>
       </w:pPr>
     </w:p>
-    <w:tbl>
-      <w:tblPr>
-        <w:tblW w:w="9026" w:type="dxa"/>
-        <w:tblLook w:firstColumn="1" w:firstRow="1" w:lastColumn="0" w:lastRow="0" w:noHBand="0" w:noVBand="1" w:val="04A0"/>
-      </w:tblPr>
-      <w:tblGrid>
-        <w:gridCol w:w="9026"/>
-      </w:tblGrid>
-      <w:tr>
-        <w:trPr>
-          <w:trHeight w:val="1985" w:hRule="atLeast"/>
-        </w:trPr>
-        <w:tc>
-          <w:tcPr>
-            <w:tcW w:w="9026" w:type="dxa"/>
-            <w:tcBorders>
-              <w:top w:val="single" w:sz="4" w:space="0" w:color="CCCCCC"/>
-              <w:start w:val="single" w:sz="4" w:space="0" w:color="CCCCCC"/>
-              <w:bottom w:val="single" w:sz="4" w:space="0" w:color="CCCCCC"/>
-              <w:end w:val="single" w:sz="4" w:space="0" w:color="CCCCCC"/>
-            </w:tcBorders>
-            <w:shd w:val="clear" w:color="auto" w:fill="F2F2F2"/>
-            <w:tcMar>
-              <w:top w:w="160" w:type="dxa"/>
-              <w:start w:w="240" w:type="dxa"/>
-              <w:bottom w:w="160" w:type="dxa"/>
-              <w:end w:w="240" w:type="dxa"/>
-            </w:tcMar>
-            <w:vAlign w:val="center"/>
-          </w:tcPr>
-          <w:p>
-            <w:pPr>
-              <w:spacing w:before="0" w:after="40"/>
-              <w:jc w:val="center"/>
-            </w:pPr>
-            <w:r>
-              <w:rPr>
-                <w:rFonts w:ascii="Arial" w:hAnsi="Arial"/>
-                <w:b w:val="0"/>
-                <w:i/>
-                <w:color w:val="AAAAAA"/>
-                <w:sz w:val="20"/>
-              </w:rPr>
-              <w:t>[ Screenshot -- Add here ]</w:t>
-            </w:r>
-          </w:p>
-          <w:p>
-            <w:pPr>
-              <w:spacing w:before="0" w:after="0"/>
-              <w:jc w:val="center"/>
-            </w:pPr>
-            <w:r>
-              <w:rPr>
-                <w:rFonts w:ascii="Arial" w:hAnsi="Arial"/>
-                <w:b w:val="0"/>
-                <w:i/>
-                <w:color w:val="BBBBBB"/>
-                <w:sz w:val="18"/>
-              </w:rPr>
-              <w:t>asset_lookup.xlsx open in Excel</w:t>
-            </w:r>
-          </w:p>
-        </w:tc>
-      </w:tr>
-    </w:tbl>
     <w:p>
       <w:pPr>
         <w:spacing w:before="120" w:after="0"/>
@@ -3021,71 +2891,6 @@
         <w:spacing w:before="120" w:after="0"/>
       </w:pPr>
     </w:p>
-    <w:tbl>
-      <w:tblPr>
-        <w:tblW w:w="9026" w:type="dxa"/>
-        <w:tblLook w:firstColumn="1" w:firstRow="1" w:lastColumn="0" w:lastRow="0" w:noHBand="0" w:noVBand="1" w:val="04A0"/>
-      </w:tblPr>
-      <w:tblGrid>
-        <w:gridCol w:w="9026"/>
-      </w:tblGrid>
-      <w:tr>
-        <w:trPr>
-          <w:trHeight w:val="1985" w:hRule="atLeast"/>
-        </w:trPr>
-        <w:tc>
-          <w:tcPr>
-            <w:tcW w:w="9026" w:type="dxa"/>
-            <w:tcBorders>
-              <w:top w:val="single" w:sz="4" w:space="0" w:color="CCCCCC"/>
-              <w:start w:val="single" w:sz="4" w:space="0" w:color="CCCCCC"/>
-              <w:bottom w:val="single" w:sz="4" w:space="0" w:color="CCCCCC"/>
-              <w:end w:val="single" w:sz="4" w:space="0" w:color="CCCCCC"/>
-            </w:tcBorders>
-            <w:shd w:val="clear" w:color="auto" w:fill="F2F2F2"/>
-            <w:tcMar>
-              <w:top w:w="160" w:type="dxa"/>
-              <w:start w:w="240" w:type="dxa"/>
-              <w:bottom w:w="160" w:type="dxa"/>
-              <w:end w:w="240" w:type="dxa"/>
-            </w:tcMar>
-            <w:vAlign w:val="center"/>
-          </w:tcPr>
-          <w:p>
-            <w:pPr>
-              <w:spacing w:before="0" w:after="40"/>
-              <w:jc w:val="center"/>
-            </w:pPr>
-            <w:r>
-              <w:rPr>
-                <w:rFonts w:ascii="Arial" w:hAnsi="Arial"/>
-                <w:b w:val="0"/>
-                <w:i/>
-                <w:color w:val="AAAAAA"/>
-                <w:sz w:val="20"/>
-              </w:rPr>
-              <w:t>[ Screenshot -- Add here ]</w:t>
-            </w:r>
-          </w:p>
-          <w:p>
-            <w:pPr>
-              <w:spacing w:before="0" w:after="0"/>
-              <w:jc w:val="center"/>
-            </w:pPr>
-            <w:r>
-              <w:rPr>
-                <w:rFonts w:ascii="Arial" w:hAnsi="Arial"/>
-                <w:b w:val="0"/>
-                <w:i/>
-                <w:color w:val="BBBBBB"/>
-                <w:sz w:val="18"/>
-              </w:rPr>
-              <w:t>Server window with buttons</w:t>
-            </w:r>
-          </w:p>
-        </w:tc>
-      </w:tr>
-    </w:tbl>
     <w:p>
       <w:pPr>
         <w:spacing w:before="120" w:after="0"/>
@@ -5603,71 +5408,6 @@
         <w:spacing w:before="160" w:after="0"/>
       </w:pPr>
     </w:p>
-    <w:tbl>
-      <w:tblPr>
-        <w:tblW w:w="9026" w:type="dxa"/>
-        <w:tblLook w:firstColumn="1" w:firstRow="1" w:lastColumn="0" w:lastRow="0" w:noHBand="0" w:noVBand="1" w:val="04A0"/>
-      </w:tblPr>
-      <w:tblGrid>
-        <w:gridCol w:w="9026"/>
-      </w:tblGrid>
-      <w:tr>
-        <w:trPr>
-          <w:trHeight w:val="1985" w:hRule="atLeast"/>
-        </w:trPr>
-        <w:tc>
-          <w:tcPr>
-            <w:tcW w:w="9026" w:type="dxa"/>
-            <w:tcBorders>
-              <w:top w:val="single" w:sz="4" w:space="0" w:color="CCCCCC"/>
-              <w:start w:val="single" w:sz="4" w:space="0" w:color="CCCCCC"/>
-              <w:bottom w:val="single" w:sz="4" w:space="0" w:color="CCCCCC"/>
-              <w:end w:val="single" w:sz="4" w:space="0" w:color="CCCCCC"/>
-            </w:tcBorders>
-            <w:shd w:val="clear" w:color="auto" w:fill="F2F2F2"/>
-            <w:tcMar>
-              <w:top w:w="160" w:type="dxa"/>
-              <w:start w:w="240" w:type="dxa"/>
-              <w:bottom w:w="160" w:type="dxa"/>
-              <w:end w:w="240" w:type="dxa"/>
-            </w:tcMar>
-            <w:vAlign w:val="center"/>
-          </w:tcPr>
-          <w:p>
-            <w:pPr>
-              <w:spacing w:before="0" w:after="40"/>
-              <w:jc w:val="center"/>
-            </w:pPr>
-            <w:r>
-              <w:rPr>
-                <w:rFonts w:ascii="Arial" w:hAnsi="Arial"/>
-                <w:b w:val="0"/>
-                <w:i/>
-                <w:color w:val="AAAAAA"/>
-                <w:sz w:val="20"/>
-              </w:rPr>
-              <w:t>[ Screenshot -- Add here ]</w:t>
-            </w:r>
-          </w:p>
-          <w:p>
-            <w:pPr>
-              <w:spacing w:before="0" w:after="0"/>
-              <w:jc w:val="center"/>
-            </w:pPr>
-            <w:r>
-              <w:rPr>
-                <w:rFonts w:ascii="Arial" w:hAnsi="Arial"/>
-                <w:b w:val="0"/>
-                <w:i/>
-                <w:color w:val="BBBBBB"/>
-                <w:sz w:val="18"/>
-              </w:rPr>
-              <w:t>Storekeeper App main screen</w:t>
-            </w:r>
-          </w:p>
-        </w:tc>
-      </w:tr>
-    </w:tbl>
     <w:p>
       <w:pPr>
         <w:spacing w:before="120" w:after="0"/>
@@ -5678,71 +5418,6 @@
         <w:spacing w:before="120" w:after="0"/>
       </w:pPr>
     </w:p>
-    <w:tbl>
-      <w:tblPr>
-        <w:tblW w:w="9026" w:type="dxa"/>
-        <w:tblLook w:firstColumn="1" w:firstRow="1" w:lastColumn="0" w:lastRow="0" w:noHBand="0" w:noVBand="1" w:val="04A0"/>
-      </w:tblPr>
-      <w:tblGrid>
-        <w:gridCol w:w="9026"/>
-      </w:tblGrid>
-      <w:tr>
-        <w:trPr>
-          <w:trHeight w:val="1985" w:hRule="atLeast"/>
-        </w:trPr>
-        <w:tc>
-          <w:tcPr>
-            <w:tcW w:w="9026" w:type="dxa"/>
-            <w:tcBorders>
-              <w:top w:val="single" w:sz="4" w:space="0" w:color="CCCCCC"/>
-              <w:start w:val="single" w:sz="4" w:space="0" w:color="CCCCCC"/>
-              <w:bottom w:val="single" w:sz="4" w:space="0" w:color="CCCCCC"/>
-              <w:end w:val="single" w:sz="4" w:space="0" w:color="CCCCCC"/>
-            </w:tcBorders>
-            <w:shd w:val="clear" w:color="auto" w:fill="F2F2F2"/>
-            <w:tcMar>
-              <w:top w:w="160" w:type="dxa"/>
-              <w:start w:w="240" w:type="dxa"/>
-              <w:bottom w:w="160" w:type="dxa"/>
-              <w:end w:w="240" w:type="dxa"/>
-            </w:tcMar>
-            <w:vAlign w:val="center"/>
-          </w:tcPr>
-          <w:p>
-            <w:pPr>
-              <w:spacing w:before="0" w:after="40"/>
-              <w:jc w:val="center"/>
-            </w:pPr>
-            <w:r>
-              <w:rPr>
-                <w:rFonts w:ascii="Arial" w:hAnsi="Arial"/>
-                <w:b w:val="0"/>
-                <w:i/>
-                <w:color w:val="AAAAAA"/>
-                <w:sz w:val="20"/>
-              </w:rPr>
-              <w:t>[ Screenshot -- Add here ]</w:t>
-            </w:r>
-          </w:p>
-          <w:p>
-            <w:pPr>
-              <w:spacing w:before="0" w:after="0"/>
-              <w:jc w:val="center"/>
-            </w:pPr>
-            <w:r>
-              <w:rPr>
-                <w:rFonts w:ascii="Arial" w:hAnsi="Arial"/>
-                <w:b w:val="0"/>
-                <w:i/>
-                <w:color w:val="BBBBBB"/>
-                <w:sz w:val="18"/>
-              </w:rPr>
-              <w:t>Notifier popup</w:t>
-            </w:r>
-          </w:p>
-        </w:tc>
-      </w:tr>
-    </w:tbl>
     <w:p>
       <w:pPr>
         <w:spacing w:before="120" w:after="0"/>
@@ -5753,71 +5428,6 @@
         <w:spacing w:before="120" w:after="0"/>
       </w:pPr>
     </w:p>
-    <w:tbl>
-      <w:tblPr>
-        <w:tblW w:w="9026" w:type="dxa"/>
-        <w:tblLook w:firstColumn="1" w:firstRow="1" w:lastColumn="0" w:lastRow="0" w:noHBand="0" w:noVBand="1" w:val="04A0"/>
-      </w:tblPr>
-      <w:tblGrid>
-        <w:gridCol w:w="9026"/>
-      </w:tblGrid>
-      <w:tr>
-        <w:trPr>
-          <w:trHeight w:val="1985" w:hRule="atLeast"/>
-        </w:trPr>
-        <w:tc>
-          <w:tcPr>
-            <w:tcW w:w="9026" w:type="dxa"/>
-            <w:tcBorders>
-              <w:top w:val="single" w:sz="4" w:space="0" w:color="CCCCCC"/>
-              <w:start w:val="single" w:sz="4" w:space="0" w:color="CCCCCC"/>
-              <w:bottom w:val="single" w:sz="4" w:space="0" w:color="CCCCCC"/>
-              <w:end w:val="single" w:sz="4" w:space="0" w:color="CCCCCC"/>
-            </w:tcBorders>
-            <w:shd w:val="clear" w:color="auto" w:fill="F2F2F2"/>
-            <w:tcMar>
-              <w:top w:w="160" w:type="dxa"/>
-              <w:start w:w="240" w:type="dxa"/>
-              <w:bottom w:w="160" w:type="dxa"/>
-              <w:end w:w="240" w:type="dxa"/>
-            </w:tcMar>
-            <w:vAlign w:val="center"/>
-          </w:tcPr>
-          <w:p>
-            <w:pPr>
-              <w:spacing w:before="0" w:after="40"/>
-              <w:jc w:val="center"/>
-            </w:pPr>
-            <w:r>
-              <w:rPr>
-                <w:rFonts w:ascii="Arial" w:hAnsi="Arial"/>
-                <w:b w:val="0"/>
-                <w:i/>
-                <w:color w:val="AAAAAA"/>
-                <w:sz w:val="20"/>
-              </w:rPr>
-              <w:t>[ Screenshot -- Add here ]</w:t>
-            </w:r>
-          </w:p>
-          <w:p>
-            <w:pPr>
-              <w:spacing w:before="0" w:after="0"/>
-              <w:jc w:val="center"/>
-            </w:pPr>
-            <w:r>
-              <w:rPr>
-                <w:rFonts w:ascii="Arial" w:hAnsi="Arial"/>
-                <w:b w:val="0"/>
-                <w:i/>
-                <w:color w:val="BBBBBB"/>
-                <w:sz w:val="18"/>
-              </w:rPr>
-              <w:t>Excel export Summary sheet</w:t>
-            </w:r>
-          </w:p>
-        </w:tc>
-      </w:tr>
-    </w:tbl>
     <w:p>
       <w:pPr>
         <w:spacing w:before="120" w:after="0"/>

</xml_diff>

<commit_message>
Docs: Tech Doc API table adds /members + /transactions/delete; User Manual notifier poll updated to 5 minutes. -- Co-Authored-By: Claude Opus 4.8 <noreply@anthropic.com>
</commit_message>
<xml_diff>
--- a/AssetManager_Technical_Documentation.docx
+++ b/AssetManager_Technical_Documentation.docx
@@ -4845,6 +4845,309 @@
           </w:p>
         </w:tc>
       </w:tr>
+      <w:tr>
+        <w:tc>
+          <w:tcPr>
+            <w:tcW w:w="2800" w:type="dxa"/>
+            <w:tcBorders>
+              <w:top w:val="single" w:sz="4" w:space="0" w:color="CCCCCC"/>
+              <w:start w:val="single" w:sz="4" w:space="0" w:color="CCCCCC"/>
+              <w:bottom w:val="single" w:sz="4" w:space="0" w:color="CCCCCC"/>
+              <w:end w:val="single" w:sz="4" w:space="0" w:color="CCCCCC"/>
+            </w:tcBorders>
+            <w:shd w:val="clear" w:color="auto" w:fill="FFFFFF"/>
+            <w:tcMar>
+              <w:top w:w="80" w:type="dxa"/>
+              <w:start w:w="140" w:type="dxa"/>
+              <w:bottom w:w="80" w:type="dxa"/>
+              <w:end w:w="140" w:type="dxa"/>
+            </w:tcMar>
+          </w:tcPr>
+          <w:p>
+            <w:pPr>
+              <w:spacing w:before="20" w:after="20"/>
+            </w:pPr>
+            <w:r>
+              <w:rPr>
+                <w:rFonts w:ascii="Arial" w:hAnsi="Arial"/>
+                <w:b w:val="0"/>
+                <w:i w:val="0"/>
+                <w:color w:val="111111"/>
+                <w:sz w:val="20"/>
+              </w:rPr>
+              <w:t>List engineers (assignees)</w:t>
+            </w:r>
+          </w:p>
+        </w:tc>
+        <w:tc>
+          <w:tcPr>
+            <w:tcW w:w="2800" w:type="dxa"/>
+            <w:tcBorders>
+              <w:top w:val="single" w:sz="4" w:space="0" w:color="CCCCCC"/>
+              <w:start w:val="single" w:sz="4" w:space="0" w:color="CCCCCC"/>
+              <w:bottom w:val="single" w:sz="4" w:space="0" w:color="CCCCCC"/>
+              <w:end w:val="single" w:sz="4" w:space="0" w:color="CCCCCC"/>
+            </w:tcBorders>
+            <w:shd w:val="clear" w:color="auto" w:fill="FFFFFF"/>
+            <w:tcMar>
+              <w:top w:w="80" w:type="dxa"/>
+              <w:start w:w="140" w:type="dxa"/>
+              <w:bottom w:w="80" w:type="dxa"/>
+              <w:end w:w="140" w:type="dxa"/>
+            </w:tcMar>
+          </w:tcPr>
+          <w:p>
+            <w:pPr>
+              <w:spacing w:before="20" w:after="20"/>
+            </w:pPr>
+            <w:r>
+              <w:rPr>
+                <w:rFonts w:ascii="Arial" w:hAnsi="Arial"/>
+                <w:b w:val="0"/>
+                <w:i w:val="0"/>
+                <w:color w:val="111111"/>
+                <w:sz w:val="20"/>
+              </w:rPr>
+              <w:t>GET /members</w:t>
+            </w:r>
+          </w:p>
+        </w:tc>
+        <w:tc>
+          <w:tcPr>
+            <w:tcW w:w="3426" w:type="dxa"/>
+            <w:tcBorders>
+              <w:top w:val="single" w:sz="4" w:space="0" w:color="CCCCCC"/>
+              <w:start w:val="single" w:sz="4" w:space="0" w:color="CCCCCC"/>
+              <w:bottom w:val="single" w:sz="4" w:space="0" w:color="CCCCCC"/>
+              <w:end w:val="single" w:sz="4" w:space="0" w:color="CCCCCC"/>
+            </w:tcBorders>
+            <w:shd w:val="clear" w:color="auto" w:fill="FFFFFF"/>
+            <w:tcMar>
+              <w:top w:w="80" w:type="dxa"/>
+              <w:start w:w="140" w:type="dxa"/>
+              <w:bottom w:w="80" w:type="dxa"/>
+              <w:end w:w="140" w:type="dxa"/>
+            </w:tcMar>
+          </w:tcPr>
+          <w:p>
+            <w:pPr>
+              <w:spacing w:before="20" w:after="20"/>
+            </w:pPr>
+            <w:r>
+              <w:rPr>
+                <w:rFonts w:ascii="Arial" w:hAnsi="Arial"/>
+                <w:b w:val="0"/>
+                <w:i w:val="0"/>
+                <w:color w:val="111111"/>
+                <w:sz w:val="20"/>
+              </w:rPr>
+              <w:t>No password needed</w:t>
+            </w:r>
+          </w:p>
+        </w:tc>
+      </w:tr>
+      <w:tr>
+        <w:tc>
+          <w:tcPr>
+            <w:tcW w:w="2800" w:type="dxa"/>
+            <w:tcBorders>
+              <w:top w:val="single" w:sz="4" w:space="0" w:color="CCCCCC"/>
+              <w:start w:val="single" w:sz="4" w:space="0" w:color="CCCCCC"/>
+              <w:bottom w:val="single" w:sz="4" w:space="0" w:color="CCCCCC"/>
+              <w:end w:val="single" w:sz="4" w:space="0" w:color="CCCCCC"/>
+            </w:tcBorders>
+            <w:shd w:val="clear" w:color="auto" w:fill="FFFFFF"/>
+            <w:tcMar>
+              <w:top w:w="80" w:type="dxa"/>
+              <w:start w:w="140" w:type="dxa"/>
+              <w:bottom w:w="80" w:type="dxa"/>
+              <w:end w:w="140" w:type="dxa"/>
+            </w:tcMar>
+          </w:tcPr>
+          <w:p>
+            <w:pPr>
+              <w:spacing w:before="20" w:after="20"/>
+            </w:pPr>
+            <w:r>
+              <w:rPr>
+                <w:rFonts w:ascii="Arial" w:hAnsi="Arial"/>
+                <w:b w:val="0"/>
+                <w:i w:val="0"/>
+                <w:color w:val="111111"/>
+                <w:sz w:val="20"/>
+              </w:rPr>
+              <w:t>Add / update an engineer</w:t>
+            </w:r>
+          </w:p>
+        </w:tc>
+        <w:tc>
+          <w:tcPr>
+            <w:tcW w:w="2800" w:type="dxa"/>
+            <w:tcBorders>
+              <w:top w:val="single" w:sz="4" w:space="0" w:color="CCCCCC"/>
+              <w:start w:val="single" w:sz="4" w:space="0" w:color="CCCCCC"/>
+              <w:bottom w:val="single" w:sz="4" w:space="0" w:color="CCCCCC"/>
+              <w:end w:val="single" w:sz="4" w:space="0" w:color="CCCCCC"/>
+            </w:tcBorders>
+            <w:shd w:val="clear" w:color="auto" w:fill="FFFFFF"/>
+            <w:tcMar>
+              <w:top w:w="80" w:type="dxa"/>
+              <w:start w:w="140" w:type="dxa"/>
+              <w:bottom w:w="80" w:type="dxa"/>
+              <w:end w:w="140" w:type="dxa"/>
+            </w:tcMar>
+          </w:tcPr>
+          <w:p>
+            <w:pPr>
+              <w:spacing w:before="20" w:after="20"/>
+            </w:pPr>
+            <w:r>
+              <w:rPr>
+                <w:rFonts w:ascii="Arial" w:hAnsi="Arial"/>
+                <w:b w:val="0"/>
+                <w:i w:val="0"/>
+                <w:color w:val="111111"/>
+                <w:sz w:val="20"/>
+              </w:rPr>
+              <w:t>POST /members</w:t>
+            </w:r>
+          </w:p>
+        </w:tc>
+        <w:tc>
+          <w:tcPr>
+            <w:tcW w:w="3426" w:type="dxa"/>
+            <w:tcBorders>
+              <w:top w:val="single" w:sz="4" w:space="0" w:color="CCCCCC"/>
+              <w:start w:val="single" w:sz="4" w:space="0" w:color="CCCCCC"/>
+              <w:bottom w:val="single" w:sz="4" w:space="0" w:color="CCCCCC"/>
+              <w:end w:val="single" w:sz="4" w:space="0" w:color="CCCCCC"/>
+            </w:tcBorders>
+            <w:shd w:val="clear" w:color="auto" w:fill="FFFFFF"/>
+            <w:tcMar>
+              <w:top w:w="80" w:type="dxa"/>
+              <w:start w:w="140" w:type="dxa"/>
+              <w:bottom w:w="80" w:type="dxa"/>
+              <w:end w:w="140" w:type="dxa"/>
+            </w:tcMar>
+          </w:tcPr>
+          <w:p>
+            <w:pPr>
+              <w:spacing w:before="20" w:after="20"/>
+            </w:pPr>
+            <w:r>
+              <w:rPr>
+                <w:rFonts w:ascii="Arial" w:hAnsi="Arial"/>
+                <w:b w:val="0"/>
+                <w:i w:val="0"/>
+                <w:color w:val="111111"/>
+                <w:sz w:val="20"/>
+              </w:rPr>
+              <w:t>Admin password required</w:t>
+            </w:r>
+          </w:p>
+        </w:tc>
+      </w:tr>
+      <w:tr>
+        <w:tc>
+          <w:tcPr>
+            <w:tcW w:w="2800" w:type="dxa"/>
+            <w:tcBorders>
+              <w:top w:val="single" w:sz="4" w:space="0" w:color="CCCCCC"/>
+              <w:start w:val="single" w:sz="4" w:space="0" w:color="CCCCCC"/>
+              <w:bottom w:val="single" w:sz="4" w:space="0" w:color="CCCCCC"/>
+              <w:end w:val="single" w:sz="4" w:space="0" w:color="CCCCCC"/>
+            </w:tcBorders>
+            <w:shd w:val="clear" w:color="auto" w:fill="FFFFFF"/>
+            <w:tcMar>
+              <w:top w:w="80" w:type="dxa"/>
+              <w:start w:w="140" w:type="dxa"/>
+              <w:bottom w:w="80" w:type="dxa"/>
+              <w:end w:w="140" w:type="dxa"/>
+            </w:tcMar>
+          </w:tcPr>
+          <w:p>
+            <w:pPr>
+              <w:spacing w:before="20" w:after="20"/>
+            </w:pPr>
+            <w:r>
+              <w:rPr>
+                <w:rFonts w:ascii="Arial" w:hAnsi="Arial"/>
+                <w:b w:val="0"/>
+                <w:i w:val="0"/>
+                <w:color w:val="111111"/>
+                <w:sz w:val="20"/>
+              </w:rPr>
+              <w:t>Delete transaction records</w:t>
+            </w:r>
+          </w:p>
+        </w:tc>
+        <w:tc>
+          <w:tcPr>
+            <w:tcW w:w="2800" w:type="dxa"/>
+            <w:tcBorders>
+              <w:top w:val="single" w:sz="4" w:space="0" w:color="CCCCCC"/>
+              <w:start w:val="single" w:sz="4" w:space="0" w:color="CCCCCC"/>
+              <w:bottom w:val="single" w:sz="4" w:space="0" w:color="CCCCCC"/>
+              <w:end w:val="single" w:sz="4" w:space="0" w:color="CCCCCC"/>
+            </w:tcBorders>
+            <w:shd w:val="clear" w:color="auto" w:fill="FFFFFF"/>
+            <w:tcMar>
+              <w:top w:w="80" w:type="dxa"/>
+              <w:start w:w="140" w:type="dxa"/>
+              <w:bottom w:w="80" w:type="dxa"/>
+              <w:end w:w="140" w:type="dxa"/>
+            </w:tcMar>
+          </w:tcPr>
+          <w:p>
+            <w:pPr>
+              <w:spacing w:before="20" w:after="20"/>
+            </w:pPr>
+            <w:r>
+              <w:rPr>
+                <w:rFonts w:ascii="Arial" w:hAnsi="Arial"/>
+                <w:b w:val="0"/>
+                <w:i w:val="0"/>
+                <w:color w:val="111111"/>
+                <w:sz w:val="20"/>
+              </w:rPr>
+              <w:t>POST /transactions/delete</w:t>
+            </w:r>
+          </w:p>
+        </w:tc>
+        <w:tc>
+          <w:tcPr>
+            <w:tcW w:w="3426" w:type="dxa"/>
+            <w:tcBorders>
+              <w:top w:val="single" w:sz="4" w:space="0" w:color="CCCCCC"/>
+              <w:start w:val="single" w:sz="4" w:space="0" w:color="CCCCCC"/>
+              <w:bottom w:val="single" w:sz="4" w:space="0" w:color="CCCCCC"/>
+              <w:end w:val="single" w:sz="4" w:space="0" w:color="CCCCCC"/>
+            </w:tcBorders>
+            <w:shd w:val="clear" w:color="auto" w:fill="FFFFFF"/>
+            <w:tcMar>
+              <w:top w:w="80" w:type="dxa"/>
+              <w:start w:w="140" w:type="dxa"/>
+              <w:bottom w:w="80" w:type="dxa"/>
+              <w:end w:w="140" w:type="dxa"/>
+            </w:tcMar>
+          </w:tcPr>
+          <w:p>
+            <w:pPr>
+              <w:spacing w:before="20" w:after="20"/>
+            </w:pPr>
+            <w:r>
+              <w:rPr>
+                <w:rFonts w:ascii="Arial" w:hAnsi="Arial"/>
+                <w:b w:val="0"/>
+                <w:i w:val="0"/>
+                <w:color w:val="111111"/>
+                <w:sz w:val="20"/>
+              </w:rPr>
+              <w:t>Admin password required</w:t>
+            </w:r>
+          </w:p>
+        </w:tc>
+      </w:tr>
     </w:tbl>
     <w:p>
       <w:pPr>

</xml_diff>

<commit_message>
Roll back to pre-feature state (v1.3.0): revert this session's 8 features, autostart, presentation redesign and doc changes. Restores working v1.3.0 code and assets.
</commit_message>
<xml_diff>
--- a/AssetManager_Technical_Documentation.docx
+++ b/AssetManager_Technical_Documentation.docx
@@ -1047,6 +1047,71 @@
         <w:spacing w:before="120" w:after="0"/>
       </w:pPr>
     </w:p>
+    <w:tbl>
+      <w:tblPr>
+        <w:tblW w:w="9026" w:type="dxa"/>
+        <w:tblLook w:firstColumn="1" w:firstRow="1" w:lastColumn="0" w:lastRow="0" w:noHBand="0" w:noVBand="1" w:val="04A0"/>
+      </w:tblPr>
+      <w:tblGrid>
+        <w:gridCol w:w="9026"/>
+      </w:tblGrid>
+      <w:tr>
+        <w:trPr>
+          <w:trHeight w:val="1985" w:hRule="atLeast"/>
+        </w:trPr>
+        <w:tc>
+          <w:tcPr>
+            <w:tcW w:w="9026" w:type="dxa"/>
+            <w:tcBorders>
+              <w:top w:val="single" w:sz="4" w:space="0" w:color="CCCCCC"/>
+              <w:start w:val="single" w:sz="4" w:space="0" w:color="CCCCCC"/>
+              <w:bottom w:val="single" w:sz="4" w:space="0" w:color="CCCCCC"/>
+              <w:end w:val="single" w:sz="4" w:space="0" w:color="CCCCCC"/>
+            </w:tcBorders>
+            <w:shd w:val="clear" w:color="auto" w:fill="F2F2F2"/>
+            <w:tcMar>
+              <w:top w:w="160" w:type="dxa"/>
+              <w:start w:w="240" w:type="dxa"/>
+              <w:bottom w:w="160" w:type="dxa"/>
+              <w:end w:w="240" w:type="dxa"/>
+            </w:tcMar>
+            <w:vAlign w:val="center"/>
+          </w:tcPr>
+          <w:p>
+            <w:pPr>
+              <w:spacing w:before="0" w:after="40"/>
+              <w:jc w:val="center"/>
+            </w:pPr>
+            <w:r>
+              <w:rPr>
+                <w:rFonts w:ascii="Arial" w:hAnsi="Arial"/>
+                <w:b w:val="0"/>
+                <w:i/>
+                <w:color w:val="AAAAAA"/>
+                <w:sz w:val="20"/>
+              </w:rPr>
+              <w:t>[ Screenshot -- Add here ]</w:t>
+            </w:r>
+          </w:p>
+          <w:p>
+            <w:pPr>
+              <w:spacing w:before="0" w:after="0"/>
+              <w:jc w:val="center"/>
+            </w:pPr>
+            <w:r>
+              <w:rPr>
+                <w:rFonts w:ascii="Arial" w:hAnsi="Arial"/>
+                <w:b w:val="0"/>
+                <w:i/>
+                <w:color w:val="BBBBBB"/>
+                <w:sz w:val="18"/>
+              </w:rPr>
+              <w:t>Server app running</w:t>
+            </w:r>
+          </w:p>
+        </w:tc>
+      </w:tr>
+    </w:tbl>
     <w:p>
       <w:pPr>
         <w:spacing w:before="120" w:after="0"/>
@@ -1856,6 +1921,71 @@
         <w:spacing w:before="120" w:after="0"/>
       </w:pPr>
     </w:p>
+    <w:tbl>
+      <w:tblPr>
+        <w:tblW w:w="9026" w:type="dxa"/>
+        <w:tblLook w:firstColumn="1" w:firstRow="1" w:lastColumn="0" w:lastRow="0" w:noHBand="0" w:noVBand="1" w:val="04A0"/>
+      </w:tblPr>
+      <w:tblGrid>
+        <w:gridCol w:w="9026"/>
+      </w:tblGrid>
+      <w:tr>
+        <w:trPr>
+          <w:trHeight w:val="1985" w:hRule="atLeast"/>
+        </w:trPr>
+        <w:tc>
+          <w:tcPr>
+            <w:tcW w:w="9026" w:type="dxa"/>
+            <w:tcBorders>
+              <w:top w:val="single" w:sz="4" w:space="0" w:color="CCCCCC"/>
+              <w:start w:val="single" w:sz="4" w:space="0" w:color="CCCCCC"/>
+              <w:bottom w:val="single" w:sz="4" w:space="0" w:color="CCCCCC"/>
+              <w:end w:val="single" w:sz="4" w:space="0" w:color="CCCCCC"/>
+            </w:tcBorders>
+            <w:shd w:val="clear" w:color="auto" w:fill="F2F2F2"/>
+            <w:tcMar>
+              <w:top w:w="160" w:type="dxa"/>
+              <w:start w:w="240" w:type="dxa"/>
+              <w:bottom w:w="160" w:type="dxa"/>
+              <w:end w:w="240" w:type="dxa"/>
+            </w:tcMar>
+            <w:vAlign w:val="center"/>
+          </w:tcPr>
+          <w:p>
+            <w:pPr>
+              <w:spacing w:before="0" w:after="40"/>
+              <w:jc w:val="center"/>
+            </w:pPr>
+            <w:r>
+              <w:rPr>
+                <w:rFonts w:ascii="Arial" w:hAnsi="Arial"/>
+                <w:b w:val="0"/>
+                <w:i/>
+                <w:color w:val="AAAAAA"/>
+                <w:sz w:val="20"/>
+              </w:rPr>
+              <w:t>[ Screenshot -- Add here ]</w:t>
+            </w:r>
+          </w:p>
+          <w:p>
+            <w:pPr>
+              <w:spacing w:before="0" w:after="0"/>
+              <w:jc w:val="center"/>
+            </w:pPr>
+            <w:r>
+              <w:rPr>
+                <w:rFonts w:ascii="Arial" w:hAnsi="Arial"/>
+                <w:b w:val="0"/>
+                <w:i/>
+                <w:color w:val="BBBBBB"/>
+                <w:sz w:val="18"/>
+              </w:rPr>
+              <w:t>asset_lookup.xlsx open in Excel</w:t>
+            </w:r>
+          </w:p>
+        </w:tc>
+      </w:tr>
+    </w:tbl>
     <w:p>
       <w:pPr>
         <w:spacing w:before="120" w:after="0"/>
@@ -2891,6 +3021,71 @@
         <w:spacing w:before="120" w:after="0"/>
       </w:pPr>
     </w:p>
+    <w:tbl>
+      <w:tblPr>
+        <w:tblW w:w="9026" w:type="dxa"/>
+        <w:tblLook w:firstColumn="1" w:firstRow="1" w:lastColumn="0" w:lastRow="0" w:noHBand="0" w:noVBand="1" w:val="04A0"/>
+      </w:tblPr>
+      <w:tblGrid>
+        <w:gridCol w:w="9026"/>
+      </w:tblGrid>
+      <w:tr>
+        <w:trPr>
+          <w:trHeight w:val="1985" w:hRule="atLeast"/>
+        </w:trPr>
+        <w:tc>
+          <w:tcPr>
+            <w:tcW w:w="9026" w:type="dxa"/>
+            <w:tcBorders>
+              <w:top w:val="single" w:sz="4" w:space="0" w:color="CCCCCC"/>
+              <w:start w:val="single" w:sz="4" w:space="0" w:color="CCCCCC"/>
+              <w:bottom w:val="single" w:sz="4" w:space="0" w:color="CCCCCC"/>
+              <w:end w:val="single" w:sz="4" w:space="0" w:color="CCCCCC"/>
+            </w:tcBorders>
+            <w:shd w:val="clear" w:color="auto" w:fill="F2F2F2"/>
+            <w:tcMar>
+              <w:top w:w="160" w:type="dxa"/>
+              <w:start w:w="240" w:type="dxa"/>
+              <w:bottom w:w="160" w:type="dxa"/>
+              <w:end w:w="240" w:type="dxa"/>
+            </w:tcMar>
+            <w:vAlign w:val="center"/>
+          </w:tcPr>
+          <w:p>
+            <w:pPr>
+              <w:spacing w:before="0" w:after="40"/>
+              <w:jc w:val="center"/>
+            </w:pPr>
+            <w:r>
+              <w:rPr>
+                <w:rFonts w:ascii="Arial" w:hAnsi="Arial"/>
+                <w:b w:val="0"/>
+                <w:i/>
+                <w:color w:val="AAAAAA"/>
+                <w:sz w:val="20"/>
+              </w:rPr>
+              <w:t>[ Screenshot -- Add here ]</w:t>
+            </w:r>
+          </w:p>
+          <w:p>
+            <w:pPr>
+              <w:spacing w:before="0" w:after="0"/>
+              <w:jc w:val="center"/>
+            </w:pPr>
+            <w:r>
+              <w:rPr>
+                <w:rFonts w:ascii="Arial" w:hAnsi="Arial"/>
+                <w:b w:val="0"/>
+                <w:i/>
+                <w:color w:val="BBBBBB"/>
+                <w:sz w:val="18"/>
+              </w:rPr>
+              <w:t>Server window with buttons</w:t>
+            </w:r>
+          </w:p>
+        </w:tc>
+      </w:tr>
+    </w:tbl>
     <w:p>
       <w:pPr>
         <w:spacing w:before="120" w:after="0"/>
@@ -3614,7 +3809,7 @@
           <w:color w:val="111111"/>
           <w:sz w:val="22"/>
         </w:rPr>
-        <w:t>If another system needs to connect to AssetManager, it can use these addresses. All requests go to the server's IP address on port 8081.</w:t>
+        <w:t>If another system needs to connect to AssetManager, it can use these addresses. All requests go to the server's IP address on port 80.</w:t>
       </w:r>
     </w:p>
     <w:p>
@@ -4845,309 +5040,6 @@
           </w:p>
         </w:tc>
       </w:tr>
-      <w:tr>
-        <w:tc>
-          <w:tcPr>
-            <w:tcW w:w="2800" w:type="dxa"/>
-            <w:tcBorders>
-              <w:top w:val="single" w:sz="4" w:space="0" w:color="CCCCCC"/>
-              <w:start w:val="single" w:sz="4" w:space="0" w:color="CCCCCC"/>
-              <w:bottom w:val="single" w:sz="4" w:space="0" w:color="CCCCCC"/>
-              <w:end w:val="single" w:sz="4" w:space="0" w:color="CCCCCC"/>
-            </w:tcBorders>
-            <w:shd w:val="clear" w:color="auto" w:fill="FFFFFF"/>
-            <w:tcMar>
-              <w:top w:w="80" w:type="dxa"/>
-              <w:start w:w="140" w:type="dxa"/>
-              <w:bottom w:w="80" w:type="dxa"/>
-              <w:end w:w="140" w:type="dxa"/>
-            </w:tcMar>
-          </w:tcPr>
-          <w:p>
-            <w:pPr>
-              <w:spacing w:before="20" w:after="20"/>
-            </w:pPr>
-            <w:r>
-              <w:rPr>
-                <w:rFonts w:ascii="Arial" w:hAnsi="Arial"/>
-                <w:b w:val="0"/>
-                <w:i w:val="0"/>
-                <w:color w:val="111111"/>
-                <w:sz w:val="20"/>
-              </w:rPr>
-              <w:t>List engineers (assignees)</w:t>
-            </w:r>
-          </w:p>
-        </w:tc>
-        <w:tc>
-          <w:tcPr>
-            <w:tcW w:w="2800" w:type="dxa"/>
-            <w:tcBorders>
-              <w:top w:val="single" w:sz="4" w:space="0" w:color="CCCCCC"/>
-              <w:start w:val="single" w:sz="4" w:space="0" w:color="CCCCCC"/>
-              <w:bottom w:val="single" w:sz="4" w:space="0" w:color="CCCCCC"/>
-              <w:end w:val="single" w:sz="4" w:space="0" w:color="CCCCCC"/>
-            </w:tcBorders>
-            <w:shd w:val="clear" w:color="auto" w:fill="FFFFFF"/>
-            <w:tcMar>
-              <w:top w:w="80" w:type="dxa"/>
-              <w:start w:w="140" w:type="dxa"/>
-              <w:bottom w:w="80" w:type="dxa"/>
-              <w:end w:w="140" w:type="dxa"/>
-            </w:tcMar>
-          </w:tcPr>
-          <w:p>
-            <w:pPr>
-              <w:spacing w:before="20" w:after="20"/>
-            </w:pPr>
-            <w:r>
-              <w:rPr>
-                <w:rFonts w:ascii="Arial" w:hAnsi="Arial"/>
-                <w:b w:val="0"/>
-                <w:i w:val="0"/>
-                <w:color w:val="111111"/>
-                <w:sz w:val="20"/>
-              </w:rPr>
-              <w:t>GET /members</w:t>
-            </w:r>
-          </w:p>
-        </w:tc>
-        <w:tc>
-          <w:tcPr>
-            <w:tcW w:w="3426" w:type="dxa"/>
-            <w:tcBorders>
-              <w:top w:val="single" w:sz="4" w:space="0" w:color="CCCCCC"/>
-              <w:start w:val="single" w:sz="4" w:space="0" w:color="CCCCCC"/>
-              <w:bottom w:val="single" w:sz="4" w:space="0" w:color="CCCCCC"/>
-              <w:end w:val="single" w:sz="4" w:space="0" w:color="CCCCCC"/>
-            </w:tcBorders>
-            <w:shd w:val="clear" w:color="auto" w:fill="FFFFFF"/>
-            <w:tcMar>
-              <w:top w:w="80" w:type="dxa"/>
-              <w:start w:w="140" w:type="dxa"/>
-              <w:bottom w:w="80" w:type="dxa"/>
-              <w:end w:w="140" w:type="dxa"/>
-            </w:tcMar>
-          </w:tcPr>
-          <w:p>
-            <w:pPr>
-              <w:spacing w:before="20" w:after="20"/>
-            </w:pPr>
-            <w:r>
-              <w:rPr>
-                <w:rFonts w:ascii="Arial" w:hAnsi="Arial"/>
-                <w:b w:val="0"/>
-                <w:i w:val="0"/>
-                <w:color w:val="111111"/>
-                <w:sz w:val="20"/>
-              </w:rPr>
-              <w:t>No password needed</w:t>
-            </w:r>
-          </w:p>
-        </w:tc>
-      </w:tr>
-      <w:tr>
-        <w:tc>
-          <w:tcPr>
-            <w:tcW w:w="2800" w:type="dxa"/>
-            <w:tcBorders>
-              <w:top w:val="single" w:sz="4" w:space="0" w:color="CCCCCC"/>
-              <w:start w:val="single" w:sz="4" w:space="0" w:color="CCCCCC"/>
-              <w:bottom w:val="single" w:sz="4" w:space="0" w:color="CCCCCC"/>
-              <w:end w:val="single" w:sz="4" w:space="0" w:color="CCCCCC"/>
-            </w:tcBorders>
-            <w:shd w:val="clear" w:color="auto" w:fill="FFFFFF"/>
-            <w:tcMar>
-              <w:top w:w="80" w:type="dxa"/>
-              <w:start w:w="140" w:type="dxa"/>
-              <w:bottom w:w="80" w:type="dxa"/>
-              <w:end w:w="140" w:type="dxa"/>
-            </w:tcMar>
-          </w:tcPr>
-          <w:p>
-            <w:pPr>
-              <w:spacing w:before="20" w:after="20"/>
-            </w:pPr>
-            <w:r>
-              <w:rPr>
-                <w:rFonts w:ascii="Arial" w:hAnsi="Arial"/>
-                <w:b w:val="0"/>
-                <w:i w:val="0"/>
-                <w:color w:val="111111"/>
-                <w:sz w:val="20"/>
-              </w:rPr>
-              <w:t>Add / update an engineer</w:t>
-            </w:r>
-          </w:p>
-        </w:tc>
-        <w:tc>
-          <w:tcPr>
-            <w:tcW w:w="2800" w:type="dxa"/>
-            <w:tcBorders>
-              <w:top w:val="single" w:sz="4" w:space="0" w:color="CCCCCC"/>
-              <w:start w:val="single" w:sz="4" w:space="0" w:color="CCCCCC"/>
-              <w:bottom w:val="single" w:sz="4" w:space="0" w:color="CCCCCC"/>
-              <w:end w:val="single" w:sz="4" w:space="0" w:color="CCCCCC"/>
-            </w:tcBorders>
-            <w:shd w:val="clear" w:color="auto" w:fill="FFFFFF"/>
-            <w:tcMar>
-              <w:top w:w="80" w:type="dxa"/>
-              <w:start w:w="140" w:type="dxa"/>
-              <w:bottom w:w="80" w:type="dxa"/>
-              <w:end w:w="140" w:type="dxa"/>
-            </w:tcMar>
-          </w:tcPr>
-          <w:p>
-            <w:pPr>
-              <w:spacing w:before="20" w:after="20"/>
-            </w:pPr>
-            <w:r>
-              <w:rPr>
-                <w:rFonts w:ascii="Arial" w:hAnsi="Arial"/>
-                <w:b w:val="0"/>
-                <w:i w:val="0"/>
-                <w:color w:val="111111"/>
-                <w:sz w:val="20"/>
-              </w:rPr>
-              <w:t>POST /members</w:t>
-            </w:r>
-          </w:p>
-        </w:tc>
-        <w:tc>
-          <w:tcPr>
-            <w:tcW w:w="3426" w:type="dxa"/>
-            <w:tcBorders>
-              <w:top w:val="single" w:sz="4" w:space="0" w:color="CCCCCC"/>
-              <w:start w:val="single" w:sz="4" w:space="0" w:color="CCCCCC"/>
-              <w:bottom w:val="single" w:sz="4" w:space="0" w:color="CCCCCC"/>
-              <w:end w:val="single" w:sz="4" w:space="0" w:color="CCCCCC"/>
-            </w:tcBorders>
-            <w:shd w:val="clear" w:color="auto" w:fill="FFFFFF"/>
-            <w:tcMar>
-              <w:top w:w="80" w:type="dxa"/>
-              <w:start w:w="140" w:type="dxa"/>
-              <w:bottom w:w="80" w:type="dxa"/>
-              <w:end w:w="140" w:type="dxa"/>
-            </w:tcMar>
-          </w:tcPr>
-          <w:p>
-            <w:pPr>
-              <w:spacing w:before="20" w:after="20"/>
-            </w:pPr>
-            <w:r>
-              <w:rPr>
-                <w:rFonts w:ascii="Arial" w:hAnsi="Arial"/>
-                <w:b w:val="0"/>
-                <w:i w:val="0"/>
-                <w:color w:val="111111"/>
-                <w:sz w:val="20"/>
-              </w:rPr>
-              <w:t>Admin password required</w:t>
-            </w:r>
-          </w:p>
-        </w:tc>
-      </w:tr>
-      <w:tr>
-        <w:tc>
-          <w:tcPr>
-            <w:tcW w:w="2800" w:type="dxa"/>
-            <w:tcBorders>
-              <w:top w:val="single" w:sz="4" w:space="0" w:color="CCCCCC"/>
-              <w:start w:val="single" w:sz="4" w:space="0" w:color="CCCCCC"/>
-              <w:bottom w:val="single" w:sz="4" w:space="0" w:color="CCCCCC"/>
-              <w:end w:val="single" w:sz="4" w:space="0" w:color="CCCCCC"/>
-            </w:tcBorders>
-            <w:shd w:val="clear" w:color="auto" w:fill="FFFFFF"/>
-            <w:tcMar>
-              <w:top w:w="80" w:type="dxa"/>
-              <w:start w:w="140" w:type="dxa"/>
-              <w:bottom w:w="80" w:type="dxa"/>
-              <w:end w:w="140" w:type="dxa"/>
-            </w:tcMar>
-          </w:tcPr>
-          <w:p>
-            <w:pPr>
-              <w:spacing w:before="20" w:after="20"/>
-            </w:pPr>
-            <w:r>
-              <w:rPr>
-                <w:rFonts w:ascii="Arial" w:hAnsi="Arial"/>
-                <w:b w:val="0"/>
-                <w:i w:val="0"/>
-                <w:color w:val="111111"/>
-                <w:sz w:val="20"/>
-              </w:rPr>
-              <w:t>Delete transaction records</w:t>
-            </w:r>
-          </w:p>
-        </w:tc>
-        <w:tc>
-          <w:tcPr>
-            <w:tcW w:w="2800" w:type="dxa"/>
-            <w:tcBorders>
-              <w:top w:val="single" w:sz="4" w:space="0" w:color="CCCCCC"/>
-              <w:start w:val="single" w:sz="4" w:space="0" w:color="CCCCCC"/>
-              <w:bottom w:val="single" w:sz="4" w:space="0" w:color="CCCCCC"/>
-              <w:end w:val="single" w:sz="4" w:space="0" w:color="CCCCCC"/>
-            </w:tcBorders>
-            <w:shd w:val="clear" w:color="auto" w:fill="FFFFFF"/>
-            <w:tcMar>
-              <w:top w:w="80" w:type="dxa"/>
-              <w:start w:w="140" w:type="dxa"/>
-              <w:bottom w:w="80" w:type="dxa"/>
-              <w:end w:w="140" w:type="dxa"/>
-            </w:tcMar>
-          </w:tcPr>
-          <w:p>
-            <w:pPr>
-              <w:spacing w:before="20" w:after="20"/>
-            </w:pPr>
-            <w:r>
-              <w:rPr>
-                <w:rFonts w:ascii="Arial" w:hAnsi="Arial"/>
-                <w:b w:val="0"/>
-                <w:i w:val="0"/>
-                <w:color w:val="111111"/>
-                <w:sz w:val="20"/>
-              </w:rPr>
-              <w:t>POST /transactions/delete</w:t>
-            </w:r>
-          </w:p>
-        </w:tc>
-        <w:tc>
-          <w:tcPr>
-            <w:tcW w:w="3426" w:type="dxa"/>
-            <w:tcBorders>
-              <w:top w:val="single" w:sz="4" w:space="0" w:color="CCCCCC"/>
-              <w:start w:val="single" w:sz="4" w:space="0" w:color="CCCCCC"/>
-              <w:bottom w:val="single" w:sz="4" w:space="0" w:color="CCCCCC"/>
-              <w:end w:val="single" w:sz="4" w:space="0" w:color="CCCCCC"/>
-            </w:tcBorders>
-            <w:shd w:val="clear" w:color="auto" w:fill="FFFFFF"/>
-            <w:tcMar>
-              <w:top w:w="80" w:type="dxa"/>
-              <w:start w:w="140" w:type="dxa"/>
-              <w:bottom w:w="80" w:type="dxa"/>
-              <w:end w:w="140" w:type="dxa"/>
-            </w:tcMar>
-          </w:tcPr>
-          <w:p>
-            <w:pPr>
-              <w:spacing w:before="20" w:after="20"/>
-            </w:pPr>
-            <w:r>
-              <w:rPr>
-                <w:rFonts w:ascii="Arial" w:hAnsi="Arial"/>
-                <w:b w:val="0"/>
-                <w:i w:val="0"/>
-                <w:color w:val="111111"/>
-                <w:sz w:val="20"/>
-              </w:rPr>
-              <w:t>Admin password required</w:t>
-            </w:r>
-          </w:p>
-        </w:tc>
-      </w:tr>
     </w:tbl>
     <w:p>
       <w:pPr>
@@ -5315,7 +5207,27 @@
                 <w:color w:val="111111"/>
                 <w:sz w:val="20"/>
               </w:rPr>
-              <w:t>Open Services (services.msc) and start the AssetManagerServer service. If missing, run the installer again to reinstall.</w:t>
+              <w:t xml:space="preserve">Make sure you right-clicked and chose </w:t>
+            </w:r>
+            <w:r>
+              <w:rPr>
+                <w:rFonts w:ascii="Arial" w:hAnsi="Arial"/>
+                <w:b/>
+                <w:i w:val="0"/>
+                <w:color w:val="111111"/>
+                <w:sz w:val="20"/>
+              </w:rPr>
+              <w:t>Run as Administrator</w:t>
+            </w:r>
+            <w:r>
+              <w:rPr>
+                <w:rFonts w:ascii="Arial" w:hAnsi="Arial"/>
+                <w:b w:val="0"/>
+                <w:i w:val="0"/>
+                <w:color w:val="111111"/>
+                <w:sz w:val="20"/>
+              </w:rPr>
+              <w:t>.</w:t>
             </w:r>
           </w:p>
         </w:tc>
@@ -5438,7 +5350,7 @@
                 <w:color w:val="111111"/>
                 <w:sz w:val="20"/>
               </w:rPr>
-              <w:t>Port 8081 is already in use</w:t>
+              <w:t>Port 80 is already in use</w:t>
             </w:r>
           </w:p>
         </w:tc>
@@ -5471,7 +5383,7 @@
                 <w:color w:val="111111"/>
                 <w:sz w:val="20"/>
               </w:rPr>
-              <w:t xml:space="preserve">Another program is using port 8081. Use the </w:t>
+              <w:t xml:space="preserve">Another program is using port 80. Use the </w:t>
             </w:r>
             <w:r>
               <w:rPr>
@@ -5491,7 +5403,7 @@
                 <w:color w:val="111111"/>
                 <w:sz w:val="20"/>
               </w:rPr>
-              <w:t xml:space="preserve"> button to switch to another port (e.g., 8082).</w:t>
+              <w:t xml:space="preserve"> button to switch to another port (e.g., 8080).</w:t>
             </w:r>
           </w:p>
         </w:tc>
@@ -5711,6 +5623,71 @@
         <w:spacing w:before="160" w:after="0"/>
       </w:pPr>
     </w:p>
+    <w:tbl>
+      <w:tblPr>
+        <w:tblW w:w="9026" w:type="dxa"/>
+        <w:tblLook w:firstColumn="1" w:firstRow="1" w:lastColumn="0" w:lastRow="0" w:noHBand="0" w:noVBand="1" w:val="04A0"/>
+      </w:tblPr>
+      <w:tblGrid>
+        <w:gridCol w:w="9026"/>
+      </w:tblGrid>
+      <w:tr>
+        <w:trPr>
+          <w:trHeight w:val="1985" w:hRule="atLeast"/>
+        </w:trPr>
+        <w:tc>
+          <w:tcPr>
+            <w:tcW w:w="9026" w:type="dxa"/>
+            <w:tcBorders>
+              <w:top w:val="single" w:sz="4" w:space="0" w:color="CCCCCC"/>
+              <w:start w:val="single" w:sz="4" w:space="0" w:color="CCCCCC"/>
+              <w:bottom w:val="single" w:sz="4" w:space="0" w:color="CCCCCC"/>
+              <w:end w:val="single" w:sz="4" w:space="0" w:color="CCCCCC"/>
+            </w:tcBorders>
+            <w:shd w:val="clear" w:color="auto" w:fill="F2F2F2"/>
+            <w:tcMar>
+              <w:top w:w="160" w:type="dxa"/>
+              <w:start w:w="240" w:type="dxa"/>
+              <w:bottom w:w="160" w:type="dxa"/>
+              <w:end w:w="240" w:type="dxa"/>
+            </w:tcMar>
+            <w:vAlign w:val="center"/>
+          </w:tcPr>
+          <w:p>
+            <w:pPr>
+              <w:spacing w:before="0" w:after="40"/>
+              <w:jc w:val="center"/>
+            </w:pPr>
+            <w:r>
+              <w:rPr>
+                <w:rFonts w:ascii="Arial" w:hAnsi="Arial"/>
+                <w:b w:val="0"/>
+                <w:i/>
+                <w:color w:val="AAAAAA"/>
+                <w:sz w:val="20"/>
+              </w:rPr>
+              <w:t>[ Screenshot -- Add here ]</w:t>
+            </w:r>
+          </w:p>
+          <w:p>
+            <w:pPr>
+              <w:spacing w:before="0" w:after="0"/>
+              <w:jc w:val="center"/>
+            </w:pPr>
+            <w:r>
+              <w:rPr>
+                <w:rFonts w:ascii="Arial" w:hAnsi="Arial"/>
+                <w:b w:val="0"/>
+                <w:i/>
+                <w:color w:val="BBBBBB"/>
+                <w:sz w:val="18"/>
+              </w:rPr>
+              <w:t>Storekeeper App main screen</w:t>
+            </w:r>
+          </w:p>
+        </w:tc>
+      </w:tr>
+    </w:tbl>
     <w:p>
       <w:pPr>
         <w:spacing w:before="120" w:after="0"/>
@@ -5721,6 +5698,71 @@
         <w:spacing w:before="120" w:after="0"/>
       </w:pPr>
     </w:p>
+    <w:tbl>
+      <w:tblPr>
+        <w:tblW w:w="9026" w:type="dxa"/>
+        <w:tblLook w:firstColumn="1" w:firstRow="1" w:lastColumn="0" w:lastRow="0" w:noHBand="0" w:noVBand="1" w:val="04A0"/>
+      </w:tblPr>
+      <w:tblGrid>
+        <w:gridCol w:w="9026"/>
+      </w:tblGrid>
+      <w:tr>
+        <w:trPr>
+          <w:trHeight w:val="1985" w:hRule="atLeast"/>
+        </w:trPr>
+        <w:tc>
+          <w:tcPr>
+            <w:tcW w:w="9026" w:type="dxa"/>
+            <w:tcBorders>
+              <w:top w:val="single" w:sz="4" w:space="0" w:color="CCCCCC"/>
+              <w:start w:val="single" w:sz="4" w:space="0" w:color="CCCCCC"/>
+              <w:bottom w:val="single" w:sz="4" w:space="0" w:color="CCCCCC"/>
+              <w:end w:val="single" w:sz="4" w:space="0" w:color="CCCCCC"/>
+            </w:tcBorders>
+            <w:shd w:val="clear" w:color="auto" w:fill="F2F2F2"/>
+            <w:tcMar>
+              <w:top w:w="160" w:type="dxa"/>
+              <w:start w:w="240" w:type="dxa"/>
+              <w:bottom w:w="160" w:type="dxa"/>
+              <w:end w:w="240" w:type="dxa"/>
+            </w:tcMar>
+            <w:vAlign w:val="center"/>
+          </w:tcPr>
+          <w:p>
+            <w:pPr>
+              <w:spacing w:before="0" w:after="40"/>
+              <w:jc w:val="center"/>
+            </w:pPr>
+            <w:r>
+              <w:rPr>
+                <w:rFonts w:ascii="Arial" w:hAnsi="Arial"/>
+                <w:b w:val="0"/>
+                <w:i/>
+                <w:color w:val="AAAAAA"/>
+                <w:sz w:val="20"/>
+              </w:rPr>
+              <w:t>[ Screenshot -- Add here ]</w:t>
+            </w:r>
+          </w:p>
+          <w:p>
+            <w:pPr>
+              <w:spacing w:before="0" w:after="0"/>
+              <w:jc w:val="center"/>
+            </w:pPr>
+            <w:r>
+              <w:rPr>
+                <w:rFonts w:ascii="Arial" w:hAnsi="Arial"/>
+                <w:b w:val="0"/>
+                <w:i/>
+                <w:color w:val="BBBBBB"/>
+                <w:sz w:val="18"/>
+              </w:rPr>
+              <w:t>Notifier popup</w:t>
+            </w:r>
+          </w:p>
+        </w:tc>
+      </w:tr>
+    </w:tbl>
     <w:p>
       <w:pPr>
         <w:spacing w:before="120" w:after="0"/>
@@ -5731,6 +5773,71 @@
         <w:spacing w:before="120" w:after="0"/>
       </w:pPr>
     </w:p>
+    <w:tbl>
+      <w:tblPr>
+        <w:tblW w:w="9026" w:type="dxa"/>
+        <w:tblLook w:firstColumn="1" w:firstRow="1" w:lastColumn="0" w:lastRow="0" w:noHBand="0" w:noVBand="1" w:val="04A0"/>
+      </w:tblPr>
+      <w:tblGrid>
+        <w:gridCol w:w="9026"/>
+      </w:tblGrid>
+      <w:tr>
+        <w:trPr>
+          <w:trHeight w:val="1985" w:hRule="atLeast"/>
+        </w:trPr>
+        <w:tc>
+          <w:tcPr>
+            <w:tcW w:w="9026" w:type="dxa"/>
+            <w:tcBorders>
+              <w:top w:val="single" w:sz="4" w:space="0" w:color="CCCCCC"/>
+              <w:start w:val="single" w:sz="4" w:space="0" w:color="CCCCCC"/>
+              <w:bottom w:val="single" w:sz="4" w:space="0" w:color="CCCCCC"/>
+              <w:end w:val="single" w:sz="4" w:space="0" w:color="CCCCCC"/>
+            </w:tcBorders>
+            <w:shd w:val="clear" w:color="auto" w:fill="F2F2F2"/>
+            <w:tcMar>
+              <w:top w:w="160" w:type="dxa"/>
+              <w:start w:w="240" w:type="dxa"/>
+              <w:bottom w:w="160" w:type="dxa"/>
+              <w:end w:w="240" w:type="dxa"/>
+            </w:tcMar>
+            <w:vAlign w:val="center"/>
+          </w:tcPr>
+          <w:p>
+            <w:pPr>
+              <w:spacing w:before="0" w:after="40"/>
+              <w:jc w:val="center"/>
+            </w:pPr>
+            <w:r>
+              <w:rPr>
+                <w:rFonts w:ascii="Arial" w:hAnsi="Arial"/>
+                <w:b w:val="0"/>
+                <w:i/>
+                <w:color w:val="AAAAAA"/>
+                <w:sz w:val="20"/>
+              </w:rPr>
+              <w:t>[ Screenshot -- Add here ]</w:t>
+            </w:r>
+          </w:p>
+          <w:p>
+            <w:pPr>
+              <w:spacing w:before="0" w:after="0"/>
+              <w:jc w:val="center"/>
+            </w:pPr>
+            <w:r>
+              <w:rPr>
+                <w:rFonts w:ascii="Arial" w:hAnsi="Arial"/>
+                <w:b w:val="0"/>
+                <w:i/>
+                <w:color w:val="BBBBBB"/>
+                <w:sz w:val="18"/>
+              </w:rPr>
+              <w:t>Excel export Summary sheet</w:t>
+            </w:r>
+          </w:p>
+        </w:tc>
+      </w:tr>
+    </w:tbl>
     <w:p>
       <w:pPr>
         <w:spacing w:before="120" w:after="0"/>

</xml_diff>

<commit_message>
Re-add 8 features (generic): notifier 5-min + persistent popup; clear-all archive export; import archive; auto-accept >24h; reject notifications; add engineers + auto-approve; admin delete single/multiple; storekeeper offline buffer. No autostart. Docs updated. -- Co-Authored-By: Claude Opus 4.8 <noreply@anthropic.com>
</commit_message>
<xml_diff>
--- a/AssetManager_Technical_Documentation.docx
+++ b/AssetManager_Technical_Documentation.docx
@@ -1047,71 +1047,6 @@
         <w:spacing w:before="120" w:after="0"/>
       </w:pPr>
     </w:p>
-    <w:tbl>
-      <w:tblPr>
-        <w:tblW w:w="9026" w:type="dxa"/>
-        <w:tblLook w:firstColumn="1" w:firstRow="1" w:lastColumn="0" w:lastRow="0" w:noHBand="0" w:noVBand="1" w:val="04A0"/>
-      </w:tblPr>
-      <w:tblGrid>
-        <w:gridCol w:w="9026"/>
-      </w:tblGrid>
-      <w:tr>
-        <w:trPr>
-          <w:trHeight w:val="1985" w:hRule="atLeast"/>
-        </w:trPr>
-        <w:tc>
-          <w:tcPr>
-            <w:tcW w:w="9026" w:type="dxa"/>
-            <w:tcBorders>
-              <w:top w:val="single" w:sz="4" w:space="0" w:color="CCCCCC"/>
-              <w:start w:val="single" w:sz="4" w:space="0" w:color="CCCCCC"/>
-              <w:bottom w:val="single" w:sz="4" w:space="0" w:color="CCCCCC"/>
-              <w:end w:val="single" w:sz="4" w:space="0" w:color="CCCCCC"/>
-            </w:tcBorders>
-            <w:shd w:val="clear" w:color="auto" w:fill="F2F2F2"/>
-            <w:tcMar>
-              <w:top w:w="160" w:type="dxa"/>
-              <w:start w:w="240" w:type="dxa"/>
-              <w:bottom w:w="160" w:type="dxa"/>
-              <w:end w:w="240" w:type="dxa"/>
-            </w:tcMar>
-            <w:vAlign w:val="center"/>
-          </w:tcPr>
-          <w:p>
-            <w:pPr>
-              <w:spacing w:before="0" w:after="40"/>
-              <w:jc w:val="center"/>
-            </w:pPr>
-            <w:r>
-              <w:rPr>
-                <w:rFonts w:ascii="Arial" w:hAnsi="Arial"/>
-                <w:b w:val="0"/>
-                <w:i/>
-                <w:color w:val="AAAAAA"/>
-                <w:sz w:val="20"/>
-              </w:rPr>
-              <w:t>[ Screenshot -- Add here ]</w:t>
-            </w:r>
-          </w:p>
-          <w:p>
-            <w:pPr>
-              <w:spacing w:before="0" w:after="0"/>
-              <w:jc w:val="center"/>
-            </w:pPr>
-            <w:r>
-              <w:rPr>
-                <w:rFonts w:ascii="Arial" w:hAnsi="Arial"/>
-                <w:b w:val="0"/>
-                <w:i/>
-                <w:color w:val="BBBBBB"/>
-                <w:sz w:val="18"/>
-              </w:rPr>
-              <w:t>Server app running</w:t>
-            </w:r>
-          </w:p>
-        </w:tc>
-      </w:tr>
-    </w:tbl>
     <w:p>
       <w:pPr>
         <w:spacing w:before="120" w:after="0"/>
@@ -1921,71 +1856,6 @@
         <w:spacing w:before="120" w:after="0"/>
       </w:pPr>
     </w:p>
-    <w:tbl>
-      <w:tblPr>
-        <w:tblW w:w="9026" w:type="dxa"/>
-        <w:tblLook w:firstColumn="1" w:firstRow="1" w:lastColumn="0" w:lastRow="0" w:noHBand="0" w:noVBand="1" w:val="04A0"/>
-      </w:tblPr>
-      <w:tblGrid>
-        <w:gridCol w:w="9026"/>
-      </w:tblGrid>
-      <w:tr>
-        <w:trPr>
-          <w:trHeight w:val="1985" w:hRule="atLeast"/>
-        </w:trPr>
-        <w:tc>
-          <w:tcPr>
-            <w:tcW w:w="9026" w:type="dxa"/>
-            <w:tcBorders>
-              <w:top w:val="single" w:sz="4" w:space="0" w:color="CCCCCC"/>
-              <w:start w:val="single" w:sz="4" w:space="0" w:color="CCCCCC"/>
-              <w:bottom w:val="single" w:sz="4" w:space="0" w:color="CCCCCC"/>
-              <w:end w:val="single" w:sz="4" w:space="0" w:color="CCCCCC"/>
-            </w:tcBorders>
-            <w:shd w:val="clear" w:color="auto" w:fill="F2F2F2"/>
-            <w:tcMar>
-              <w:top w:w="160" w:type="dxa"/>
-              <w:start w:w="240" w:type="dxa"/>
-              <w:bottom w:w="160" w:type="dxa"/>
-              <w:end w:w="240" w:type="dxa"/>
-            </w:tcMar>
-            <w:vAlign w:val="center"/>
-          </w:tcPr>
-          <w:p>
-            <w:pPr>
-              <w:spacing w:before="0" w:after="40"/>
-              <w:jc w:val="center"/>
-            </w:pPr>
-            <w:r>
-              <w:rPr>
-                <w:rFonts w:ascii="Arial" w:hAnsi="Arial"/>
-                <w:b w:val="0"/>
-                <w:i/>
-                <w:color w:val="AAAAAA"/>
-                <w:sz w:val="20"/>
-              </w:rPr>
-              <w:t>[ Screenshot -- Add here ]</w:t>
-            </w:r>
-          </w:p>
-          <w:p>
-            <w:pPr>
-              <w:spacing w:before="0" w:after="0"/>
-              <w:jc w:val="center"/>
-            </w:pPr>
-            <w:r>
-              <w:rPr>
-                <w:rFonts w:ascii="Arial" w:hAnsi="Arial"/>
-                <w:b w:val="0"/>
-                <w:i/>
-                <w:color w:val="BBBBBB"/>
-                <w:sz w:val="18"/>
-              </w:rPr>
-              <w:t>asset_lookup.xlsx open in Excel</w:t>
-            </w:r>
-          </w:p>
-        </w:tc>
-      </w:tr>
-    </w:tbl>
     <w:p>
       <w:pPr>
         <w:spacing w:before="120" w:after="0"/>
@@ -3021,71 +2891,6 @@
         <w:spacing w:before="120" w:after="0"/>
       </w:pPr>
     </w:p>
-    <w:tbl>
-      <w:tblPr>
-        <w:tblW w:w="9026" w:type="dxa"/>
-        <w:tblLook w:firstColumn="1" w:firstRow="1" w:lastColumn="0" w:lastRow="0" w:noHBand="0" w:noVBand="1" w:val="04A0"/>
-      </w:tblPr>
-      <w:tblGrid>
-        <w:gridCol w:w="9026"/>
-      </w:tblGrid>
-      <w:tr>
-        <w:trPr>
-          <w:trHeight w:val="1985" w:hRule="atLeast"/>
-        </w:trPr>
-        <w:tc>
-          <w:tcPr>
-            <w:tcW w:w="9026" w:type="dxa"/>
-            <w:tcBorders>
-              <w:top w:val="single" w:sz="4" w:space="0" w:color="CCCCCC"/>
-              <w:start w:val="single" w:sz="4" w:space="0" w:color="CCCCCC"/>
-              <w:bottom w:val="single" w:sz="4" w:space="0" w:color="CCCCCC"/>
-              <w:end w:val="single" w:sz="4" w:space="0" w:color="CCCCCC"/>
-            </w:tcBorders>
-            <w:shd w:val="clear" w:color="auto" w:fill="F2F2F2"/>
-            <w:tcMar>
-              <w:top w:w="160" w:type="dxa"/>
-              <w:start w:w="240" w:type="dxa"/>
-              <w:bottom w:w="160" w:type="dxa"/>
-              <w:end w:w="240" w:type="dxa"/>
-            </w:tcMar>
-            <w:vAlign w:val="center"/>
-          </w:tcPr>
-          <w:p>
-            <w:pPr>
-              <w:spacing w:before="0" w:after="40"/>
-              <w:jc w:val="center"/>
-            </w:pPr>
-            <w:r>
-              <w:rPr>
-                <w:rFonts w:ascii="Arial" w:hAnsi="Arial"/>
-                <w:b w:val="0"/>
-                <w:i/>
-                <w:color w:val="AAAAAA"/>
-                <w:sz w:val="20"/>
-              </w:rPr>
-              <w:t>[ Screenshot -- Add here ]</w:t>
-            </w:r>
-          </w:p>
-          <w:p>
-            <w:pPr>
-              <w:spacing w:before="0" w:after="0"/>
-              <w:jc w:val="center"/>
-            </w:pPr>
-            <w:r>
-              <w:rPr>
-                <w:rFonts w:ascii="Arial" w:hAnsi="Arial"/>
-                <w:b w:val="0"/>
-                <w:i/>
-                <w:color w:val="BBBBBB"/>
-                <w:sz w:val="18"/>
-              </w:rPr>
-              <w:t>Server window with buttons</w:t>
-            </w:r>
-          </w:p>
-        </w:tc>
-      </w:tr>
-    </w:tbl>
     <w:p>
       <w:pPr>
         <w:spacing w:before="120" w:after="0"/>
@@ -3809,7 +3614,7 @@
           <w:color w:val="111111"/>
           <w:sz w:val="22"/>
         </w:rPr>
-        <w:t>If another system needs to connect to AssetManager, it can use these addresses. All requests go to the server's IP address on port 80.</w:t>
+        <w:t>If another system needs to connect to AssetManager, it can use these addresses. All requests go to the server's IP address on port 8081.</w:t>
       </w:r>
     </w:p>
     <w:p>
@@ -5040,6 +4845,309 @@
           </w:p>
         </w:tc>
       </w:tr>
+      <w:tr>
+        <w:tc>
+          <w:tcPr>
+            <w:tcW w:w="2800" w:type="dxa"/>
+            <w:tcBorders>
+              <w:top w:val="single" w:sz="4" w:space="0" w:color="CCCCCC"/>
+              <w:start w:val="single" w:sz="4" w:space="0" w:color="CCCCCC"/>
+              <w:bottom w:val="single" w:sz="4" w:space="0" w:color="CCCCCC"/>
+              <w:end w:val="single" w:sz="4" w:space="0" w:color="CCCCCC"/>
+            </w:tcBorders>
+            <w:shd w:val="clear" w:color="auto" w:fill="FFFFFF"/>
+            <w:tcMar>
+              <w:top w:w="80" w:type="dxa"/>
+              <w:start w:w="140" w:type="dxa"/>
+              <w:bottom w:w="80" w:type="dxa"/>
+              <w:end w:w="140" w:type="dxa"/>
+            </w:tcMar>
+          </w:tcPr>
+          <w:p>
+            <w:pPr>
+              <w:spacing w:before="20" w:after="20"/>
+            </w:pPr>
+            <w:r>
+              <w:rPr>
+                <w:rFonts w:ascii="Arial" w:hAnsi="Arial"/>
+                <w:b w:val="0"/>
+                <w:i w:val="0"/>
+                <w:color w:val="111111"/>
+                <w:sz w:val="20"/>
+              </w:rPr>
+              <w:t>List engineers (assignees)</w:t>
+            </w:r>
+          </w:p>
+        </w:tc>
+        <w:tc>
+          <w:tcPr>
+            <w:tcW w:w="2800" w:type="dxa"/>
+            <w:tcBorders>
+              <w:top w:val="single" w:sz="4" w:space="0" w:color="CCCCCC"/>
+              <w:start w:val="single" w:sz="4" w:space="0" w:color="CCCCCC"/>
+              <w:bottom w:val="single" w:sz="4" w:space="0" w:color="CCCCCC"/>
+              <w:end w:val="single" w:sz="4" w:space="0" w:color="CCCCCC"/>
+            </w:tcBorders>
+            <w:shd w:val="clear" w:color="auto" w:fill="FFFFFF"/>
+            <w:tcMar>
+              <w:top w:w="80" w:type="dxa"/>
+              <w:start w:w="140" w:type="dxa"/>
+              <w:bottom w:w="80" w:type="dxa"/>
+              <w:end w:w="140" w:type="dxa"/>
+            </w:tcMar>
+          </w:tcPr>
+          <w:p>
+            <w:pPr>
+              <w:spacing w:before="20" w:after="20"/>
+            </w:pPr>
+            <w:r>
+              <w:rPr>
+                <w:rFonts w:ascii="Arial" w:hAnsi="Arial"/>
+                <w:b w:val="0"/>
+                <w:i w:val="0"/>
+                <w:color w:val="111111"/>
+                <w:sz w:val="20"/>
+              </w:rPr>
+              <w:t>GET /members</w:t>
+            </w:r>
+          </w:p>
+        </w:tc>
+        <w:tc>
+          <w:tcPr>
+            <w:tcW w:w="3426" w:type="dxa"/>
+            <w:tcBorders>
+              <w:top w:val="single" w:sz="4" w:space="0" w:color="CCCCCC"/>
+              <w:start w:val="single" w:sz="4" w:space="0" w:color="CCCCCC"/>
+              <w:bottom w:val="single" w:sz="4" w:space="0" w:color="CCCCCC"/>
+              <w:end w:val="single" w:sz="4" w:space="0" w:color="CCCCCC"/>
+            </w:tcBorders>
+            <w:shd w:val="clear" w:color="auto" w:fill="FFFFFF"/>
+            <w:tcMar>
+              <w:top w:w="80" w:type="dxa"/>
+              <w:start w:w="140" w:type="dxa"/>
+              <w:bottom w:w="80" w:type="dxa"/>
+              <w:end w:w="140" w:type="dxa"/>
+            </w:tcMar>
+          </w:tcPr>
+          <w:p>
+            <w:pPr>
+              <w:spacing w:before="20" w:after="20"/>
+            </w:pPr>
+            <w:r>
+              <w:rPr>
+                <w:rFonts w:ascii="Arial" w:hAnsi="Arial"/>
+                <w:b w:val="0"/>
+                <w:i w:val="0"/>
+                <w:color w:val="111111"/>
+                <w:sz w:val="20"/>
+              </w:rPr>
+              <w:t>No password needed</w:t>
+            </w:r>
+          </w:p>
+        </w:tc>
+      </w:tr>
+      <w:tr>
+        <w:tc>
+          <w:tcPr>
+            <w:tcW w:w="2800" w:type="dxa"/>
+            <w:tcBorders>
+              <w:top w:val="single" w:sz="4" w:space="0" w:color="CCCCCC"/>
+              <w:start w:val="single" w:sz="4" w:space="0" w:color="CCCCCC"/>
+              <w:bottom w:val="single" w:sz="4" w:space="0" w:color="CCCCCC"/>
+              <w:end w:val="single" w:sz="4" w:space="0" w:color="CCCCCC"/>
+            </w:tcBorders>
+            <w:shd w:val="clear" w:color="auto" w:fill="FFFFFF"/>
+            <w:tcMar>
+              <w:top w:w="80" w:type="dxa"/>
+              <w:start w:w="140" w:type="dxa"/>
+              <w:bottom w:w="80" w:type="dxa"/>
+              <w:end w:w="140" w:type="dxa"/>
+            </w:tcMar>
+          </w:tcPr>
+          <w:p>
+            <w:pPr>
+              <w:spacing w:before="20" w:after="20"/>
+            </w:pPr>
+            <w:r>
+              <w:rPr>
+                <w:rFonts w:ascii="Arial" w:hAnsi="Arial"/>
+                <w:b w:val="0"/>
+                <w:i w:val="0"/>
+                <w:color w:val="111111"/>
+                <w:sz w:val="20"/>
+              </w:rPr>
+              <w:t>Add / update an engineer</w:t>
+            </w:r>
+          </w:p>
+        </w:tc>
+        <w:tc>
+          <w:tcPr>
+            <w:tcW w:w="2800" w:type="dxa"/>
+            <w:tcBorders>
+              <w:top w:val="single" w:sz="4" w:space="0" w:color="CCCCCC"/>
+              <w:start w:val="single" w:sz="4" w:space="0" w:color="CCCCCC"/>
+              <w:bottom w:val="single" w:sz="4" w:space="0" w:color="CCCCCC"/>
+              <w:end w:val="single" w:sz="4" w:space="0" w:color="CCCCCC"/>
+            </w:tcBorders>
+            <w:shd w:val="clear" w:color="auto" w:fill="FFFFFF"/>
+            <w:tcMar>
+              <w:top w:w="80" w:type="dxa"/>
+              <w:start w:w="140" w:type="dxa"/>
+              <w:bottom w:w="80" w:type="dxa"/>
+              <w:end w:w="140" w:type="dxa"/>
+            </w:tcMar>
+          </w:tcPr>
+          <w:p>
+            <w:pPr>
+              <w:spacing w:before="20" w:after="20"/>
+            </w:pPr>
+            <w:r>
+              <w:rPr>
+                <w:rFonts w:ascii="Arial" w:hAnsi="Arial"/>
+                <w:b w:val="0"/>
+                <w:i w:val="0"/>
+                <w:color w:val="111111"/>
+                <w:sz w:val="20"/>
+              </w:rPr>
+              <w:t>POST /members</w:t>
+            </w:r>
+          </w:p>
+        </w:tc>
+        <w:tc>
+          <w:tcPr>
+            <w:tcW w:w="3426" w:type="dxa"/>
+            <w:tcBorders>
+              <w:top w:val="single" w:sz="4" w:space="0" w:color="CCCCCC"/>
+              <w:start w:val="single" w:sz="4" w:space="0" w:color="CCCCCC"/>
+              <w:bottom w:val="single" w:sz="4" w:space="0" w:color="CCCCCC"/>
+              <w:end w:val="single" w:sz="4" w:space="0" w:color="CCCCCC"/>
+            </w:tcBorders>
+            <w:shd w:val="clear" w:color="auto" w:fill="FFFFFF"/>
+            <w:tcMar>
+              <w:top w:w="80" w:type="dxa"/>
+              <w:start w:w="140" w:type="dxa"/>
+              <w:bottom w:w="80" w:type="dxa"/>
+              <w:end w:w="140" w:type="dxa"/>
+            </w:tcMar>
+          </w:tcPr>
+          <w:p>
+            <w:pPr>
+              <w:spacing w:before="20" w:after="20"/>
+            </w:pPr>
+            <w:r>
+              <w:rPr>
+                <w:rFonts w:ascii="Arial" w:hAnsi="Arial"/>
+                <w:b w:val="0"/>
+                <w:i w:val="0"/>
+                <w:color w:val="111111"/>
+                <w:sz w:val="20"/>
+              </w:rPr>
+              <w:t>Admin password required</w:t>
+            </w:r>
+          </w:p>
+        </w:tc>
+      </w:tr>
+      <w:tr>
+        <w:tc>
+          <w:tcPr>
+            <w:tcW w:w="2800" w:type="dxa"/>
+            <w:tcBorders>
+              <w:top w:val="single" w:sz="4" w:space="0" w:color="CCCCCC"/>
+              <w:start w:val="single" w:sz="4" w:space="0" w:color="CCCCCC"/>
+              <w:bottom w:val="single" w:sz="4" w:space="0" w:color="CCCCCC"/>
+              <w:end w:val="single" w:sz="4" w:space="0" w:color="CCCCCC"/>
+            </w:tcBorders>
+            <w:shd w:val="clear" w:color="auto" w:fill="FFFFFF"/>
+            <w:tcMar>
+              <w:top w:w="80" w:type="dxa"/>
+              <w:start w:w="140" w:type="dxa"/>
+              <w:bottom w:w="80" w:type="dxa"/>
+              <w:end w:w="140" w:type="dxa"/>
+            </w:tcMar>
+          </w:tcPr>
+          <w:p>
+            <w:pPr>
+              <w:spacing w:before="20" w:after="20"/>
+            </w:pPr>
+            <w:r>
+              <w:rPr>
+                <w:rFonts w:ascii="Arial" w:hAnsi="Arial"/>
+                <w:b w:val="0"/>
+                <w:i w:val="0"/>
+                <w:color w:val="111111"/>
+                <w:sz w:val="20"/>
+              </w:rPr>
+              <w:t>Delete transaction records</w:t>
+            </w:r>
+          </w:p>
+        </w:tc>
+        <w:tc>
+          <w:tcPr>
+            <w:tcW w:w="2800" w:type="dxa"/>
+            <w:tcBorders>
+              <w:top w:val="single" w:sz="4" w:space="0" w:color="CCCCCC"/>
+              <w:start w:val="single" w:sz="4" w:space="0" w:color="CCCCCC"/>
+              <w:bottom w:val="single" w:sz="4" w:space="0" w:color="CCCCCC"/>
+              <w:end w:val="single" w:sz="4" w:space="0" w:color="CCCCCC"/>
+            </w:tcBorders>
+            <w:shd w:val="clear" w:color="auto" w:fill="FFFFFF"/>
+            <w:tcMar>
+              <w:top w:w="80" w:type="dxa"/>
+              <w:start w:w="140" w:type="dxa"/>
+              <w:bottom w:w="80" w:type="dxa"/>
+              <w:end w:w="140" w:type="dxa"/>
+            </w:tcMar>
+          </w:tcPr>
+          <w:p>
+            <w:pPr>
+              <w:spacing w:before="20" w:after="20"/>
+            </w:pPr>
+            <w:r>
+              <w:rPr>
+                <w:rFonts w:ascii="Arial" w:hAnsi="Arial"/>
+                <w:b w:val="0"/>
+                <w:i w:val="0"/>
+                <w:color w:val="111111"/>
+                <w:sz w:val="20"/>
+              </w:rPr>
+              <w:t>POST /transactions/delete</w:t>
+            </w:r>
+          </w:p>
+        </w:tc>
+        <w:tc>
+          <w:tcPr>
+            <w:tcW w:w="3426" w:type="dxa"/>
+            <w:tcBorders>
+              <w:top w:val="single" w:sz="4" w:space="0" w:color="CCCCCC"/>
+              <w:start w:val="single" w:sz="4" w:space="0" w:color="CCCCCC"/>
+              <w:bottom w:val="single" w:sz="4" w:space="0" w:color="CCCCCC"/>
+              <w:end w:val="single" w:sz="4" w:space="0" w:color="CCCCCC"/>
+            </w:tcBorders>
+            <w:shd w:val="clear" w:color="auto" w:fill="FFFFFF"/>
+            <w:tcMar>
+              <w:top w:w="80" w:type="dxa"/>
+              <w:start w:w="140" w:type="dxa"/>
+              <w:bottom w:w="80" w:type="dxa"/>
+              <w:end w:w="140" w:type="dxa"/>
+            </w:tcMar>
+          </w:tcPr>
+          <w:p>
+            <w:pPr>
+              <w:spacing w:before="20" w:after="20"/>
+            </w:pPr>
+            <w:r>
+              <w:rPr>
+                <w:rFonts w:ascii="Arial" w:hAnsi="Arial"/>
+                <w:b w:val="0"/>
+                <w:i w:val="0"/>
+                <w:color w:val="111111"/>
+                <w:sz w:val="20"/>
+              </w:rPr>
+              <w:t>Admin password required</w:t>
+            </w:r>
+          </w:p>
+        </w:tc>
+      </w:tr>
     </w:tbl>
     <w:p>
       <w:pPr>
@@ -5207,27 +5315,7 @@
                 <w:color w:val="111111"/>
                 <w:sz w:val="20"/>
               </w:rPr>
-              <w:t xml:space="preserve">Make sure you right-clicked and chose </w:t>
-            </w:r>
-            <w:r>
-              <w:rPr>
-                <w:rFonts w:ascii="Arial" w:hAnsi="Arial"/>
-                <w:b/>
-                <w:i w:val="0"/>
-                <w:color w:val="111111"/>
-                <w:sz w:val="20"/>
-              </w:rPr>
-              <w:t>Run as Administrator</w:t>
-            </w:r>
-            <w:r>
-              <w:rPr>
-                <w:rFonts w:ascii="Arial" w:hAnsi="Arial"/>
-                <w:b w:val="0"/>
-                <w:i w:val="0"/>
-                <w:color w:val="111111"/>
-                <w:sz w:val="20"/>
-              </w:rPr>
-              <w:t>.</w:t>
+              <w:t>Open Services (services.msc) and start the AssetManagerServer service. If missing, run the installer again to reinstall.</w:t>
             </w:r>
           </w:p>
         </w:tc>
@@ -5350,7 +5438,7 @@
                 <w:color w:val="111111"/>
                 <w:sz w:val="20"/>
               </w:rPr>
-              <w:t>Port 80 is already in use</w:t>
+              <w:t>Port 8081 is already in use</w:t>
             </w:r>
           </w:p>
         </w:tc>
@@ -5383,7 +5471,7 @@
                 <w:color w:val="111111"/>
                 <w:sz w:val="20"/>
               </w:rPr>
-              <w:t xml:space="preserve">Another program is using port 80. Use the </w:t>
+              <w:t xml:space="preserve">Another program is using port 8081. Use the </w:t>
             </w:r>
             <w:r>
               <w:rPr>
@@ -5403,7 +5491,7 @@
                 <w:color w:val="111111"/>
                 <w:sz w:val="20"/>
               </w:rPr>
-              <w:t xml:space="preserve"> button to switch to another port (e.g., 8080).</w:t>
+              <w:t xml:space="preserve"> button to switch to another port (e.g., 8082).</w:t>
             </w:r>
           </w:p>
         </w:tc>
@@ -5623,71 +5711,6 @@
         <w:spacing w:before="160" w:after="0"/>
       </w:pPr>
     </w:p>
-    <w:tbl>
-      <w:tblPr>
-        <w:tblW w:w="9026" w:type="dxa"/>
-        <w:tblLook w:firstColumn="1" w:firstRow="1" w:lastColumn="0" w:lastRow="0" w:noHBand="0" w:noVBand="1" w:val="04A0"/>
-      </w:tblPr>
-      <w:tblGrid>
-        <w:gridCol w:w="9026"/>
-      </w:tblGrid>
-      <w:tr>
-        <w:trPr>
-          <w:trHeight w:val="1985" w:hRule="atLeast"/>
-        </w:trPr>
-        <w:tc>
-          <w:tcPr>
-            <w:tcW w:w="9026" w:type="dxa"/>
-            <w:tcBorders>
-              <w:top w:val="single" w:sz="4" w:space="0" w:color="CCCCCC"/>
-              <w:start w:val="single" w:sz="4" w:space="0" w:color="CCCCCC"/>
-              <w:bottom w:val="single" w:sz="4" w:space="0" w:color="CCCCCC"/>
-              <w:end w:val="single" w:sz="4" w:space="0" w:color="CCCCCC"/>
-            </w:tcBorders>
-            <w:shd w:val="clear" w:color="auto" w:fill="F2F2F2"/>
-            <w:tcMar>
-              <w:top w:w="160" w:type="dxa"/>
-              <w:start w:w="240" w:type="dxa"/>
-              <w:bottom w:w="160" w:type="dxa"/>
-              <w:end w:w="240" w:type="dxa"/>
-            </w:tcMar>
-            <w:vAlign w:val="center"/>
-          </w:tcPr>
-          <w:p>
-            <w:pPr>
-              <w:spacing w:before="0" w:after="40"/>
-              <w:jc w:val="center"/>
-            </w:pPr>
-            <w:r>
-              <w:rPr>
-                <w:rFonts w:ascii="Arial" w:hAnsi="Arial"/>
-                <w:b w:val="0"/>
-                <w:i/>
-                <w:color w:val="AAAAAA"/>
-                <w:sz w:val="20"/>
-              </w:rPr>
-              <w:t>[ Screenshot -- Add here ]</w:t>
-            </w:r>
-          </w:p>
-          <w:p>
-            <w:pPr>
-              <w:spacing w:before="0" w:after="0"/>
-              <w:jc w:val="center"/>
-            </w:pPr>
-            <w:r>
-              <w:rPr>
-                <w:rFonts w:ascii="Arial" w:hAnsi="Arial"/>
-                <w:b w:val="0"/>
-                <w:i/>
-                <w:color w:val="BBBBBB"/>
-                <w:sz w:val="18"/>
-              </w:rPr>
-              <w:t>Storekeeper App main screen</w:t>
-            </w:r>
-          </w:p>
-        </w:tc>
-      </w:tr>
-    </w:tbl>
     <w:p>
       <w:pPr>
         <w:spacing w:before="120" w:after="0"/>
@@ -5698,71 +5721,6 @@
         <w:spacing w:before="120" w:after="0"/>
       </w:pPr>
     </w:p>
-    <w:tbl>
-      <w:tblPr>
-        <w:tblW w:w="9026" w:type="dxa"/>
-        <w:tblLook w:firstColumn="1" w:firstRow="1" w:lastColumn="0" w:lastRow="0" w:noHBand="0" w:noVBand="1" w:val="04A0"/>
-      </w:tblPr>
-      <w:tblGrid>
-        <w:gridCol w:w="9026"/>
-      </w:tblGrid>
-      <w:tr>
-        <w:trPr>
-          <w:trHeight w:val="1985" w:hRule="atLeast"/>
-        </w:trPr>
-        <w:tc>
-          <w:tcPr>
-            <w:tcW w:w="9026" w:type="dxa"/>
-            <w:tcBorders>
-              <w:top w:val="single" w:sz="4" w:space="0" w:color="CCCCCC"/>
-              <w:start w:val="single" w:sz="4" w:space="0" w:color="CCCCCC"/>
-              <w:bottom w:val="single" w:sz="4" w:space="0" w:color="CCCCCC"/>
-              <w:end w:val="single" w:sz="4" w:space="0" w:color="CCCCCC"/>
-            </w:tcBorders>
-            <w:shd w:val="clear" w:color="auto" w:fill="F2F2F2"/>
-            <w:tcMar>
-              <w:top w:w="160" w:type="dxa"/>
-              <w:start w:w="240" w:type="dxa"/>
-              <w:bottom w:w="160" w:type="dxa"/>
-              <w:end w:w="240" w:type="dxa"/>
-            </w:tcMar>
-            <w:vAlign w:val="center"/>
-          </w:tcPr>
-          <w:p>
-            <w:pPr>
-              <w:spacing w:before="0" w:after="40"/>
-              <w:jc w:val="center"/>
-            </w:pPr>
-            <w:r>
-              <w:rPr>
-                <w:rFonts w:ascii="Arial" w:hAnsi="Arial"/>
-                <w:b w:val="0"/>
-                <w:i/>
-                <w:color w:val="AAAAAA"/>
-                <w:sz w:val="20"/>
-              </w:rPr>
-              <w:t>[ Screenshot -- Add here ]</w:t>
-            </w:r>
-          </w:p>
-          <w:p>
-            <w:pPr>
-              <w:spacing w:before="0" w:after="0"/>
-              <w:jc w:val="center"/>
-            </w:pPr>
-            <w:r>
-              <w:rPr>
-                <w:rFonts w:ascii="Arial" w:hAnsi="Arial"/>
-                <w:b w:val="0"/>
-                <w:i/>
-                <w:color w:val="BBBBBB"/>
-                <w:sz w:val="18"/>
-              </w:rPr>
-              <w:t>Notifier popup</w:t>
-            </w:r>
-          </w:p>
-        </w:tc>
-      </w:tr>
-    </w:tbl>
     <w:p>
       <w:pPr>
         <w:spacing w:before="120" w:after="0"/>
@@ -5773,71 +5731,6 @@
         <w:spacing w:before="120" w:after="0"/>
       </w:pPr>
     </w:p>
-    <w:tbl>
-      <w:tblPr>
-        <w:tblW w:w="9026" w:type="dxa"/>
-        <w:tblLook w:firstColumn="1" w:firstRow="1" w:lastColumn="0" w:lastRow="0" w:noHBand="0" w:noVBand="1" w:val="04A0"/>
-      </w:tblPr>
-      <w:tblGrid>
-        <w:gridCol w:w="9026"/>
-      </w:tblGrid>
-      <w:tr>
-        <w:trPr>
-          <w:trHeight w:val="1985" w:hRule="atLeast"/>
-        </w:trPr>
-        <w:tc>
-          <w:tcPr>
-            <w:tcW w:w="9026" w:type="dxa"/>
-            <w:tcBorders>
-              <w:top w:val="single" w:sz="4" w:space="0" w:color="CCCCCC"/>
-              <w:start w:val="single" w:sz="4" w:space="0" w:color="CCCCCC"/>
-              <w:bottom w:val="single" w:sz="4" w:space="0" w:color="CCCCCC"/>
-              <w:end w:val="single" w:sz="4" w:space="0" w:color="CCCCCC"/>
-            </w:tcBorders>
-            <w:shd w:val="clear" w:color="auto" w:fill="F2F2F2"/>
-            <w:tcMar>
-              <w:top w:w="160" w:type="dxa"/>
-              <w:start w:w="240" w:type="dxa"/>
-              <w:bottom w:w="160" w:type="dxa"/>
-              <w:end w:w="240" w:type="dxa"/>
-            </w:tcMar>
-            <w:vAlign w:val="center"/>
-          </w:tcPr>
-          <w:p>
-            <w:pPr>
-              <w:spacing w:before="0" w:after="40"/>
-              <w:jc w:val="center"/>
-            </w:pPr>
-            <w:r>
-              <w:rPr>
-                <w:rFonts w:ascii="Arial" w:hAnsi="Arial"/>
-                <w:b w:val="0"/>
-                <w:i/>
-                <w:color w:val="AAAAAA"/>
-                <w:sz w:val="20"/>
-              </w:rPr>
-              <w:t>[ Screenshot -- Add here ]</w:t>
-            </w:r>
-          </w:p>
-          <w:p>
-            <w:pPr>
-              <w:spacing w:before="0" w:after="0"/>
-              <w:jc w:val="center"/>
-            </w:pPr>
-            <w:r>
-              <w:rPr>
-                <w:rFonts w:ascii="Arial" w:hAnsi="Arial"/>
-                <w:b w:val="0"/>
-                <w:i/>
-                <w:color w:val="BBBBBB"/>
-                <w:sz w:val="18"/>
-              </w:rPr>
-              <w:t>Excel export Summary sheet</w:t>
-            </w:r>
-          </w:p>
-        </w:tc>
-      </w:tr>
-    </w:tbl>
     <w:p>
       <w:pPr>
         <w:spacing w:before="120" w:after="0"/>

</xml_diff>

<commit_message>
v1.4.0: UX refinements on top of the feature set
- Server: merge "Clear All Records" + "Manage/Delete Records" into one
  Manage/Delete window with a Select All button. Deleting any selection
  (subset or all) now always offers "export these records to an archive
  first" (archives exactly the rows being deleted). _export_records_xlsx
  gains an optional ids filter.
- Storekeeper: history auto-refreshes every 15s (filters/search preserved)
  so confirm/reject status updates without a manual refresh; reject-popup
  forces the window topmost so it can't be missed; Add Engineer is now a
  visible full-width button under Assign To.
- Notifier: default poll_interval 300s -> 15s for near-instant notifications.
- Docs: Technical Documentation and User Manual updated to match.

Co-Authored-By: Claude Opus 4.8 <noreply@anthropic.com>
</commit_message>
<xml_diff>
--- a/AssetManager_Technical_Documentation.docx
+++ b/AssetManager_Technical_Documentation.docx
@@ -2838,7 +2838,7 @@
           <w:b/>
           <w:bCs/>
         </w:rPr>
-        <w:t>5.1  Clear All Records</w:t>
+        <w:t>5.1  Manage / Delete Records</w:t>
       </w:r>
     </w:p>
     <w:p>
@@ -2847,7 +2847,7 @@
       </w:pPr>
       <w:r>
         <w:rPr/>
-        <w:t>The Clear All Records button permanently deletes all transaction records from the database. It is available only in the Server App window, protected by admin password.</w:t>
+        <w:t>The Manage / Delete Records button (Server App window, admin password) lets the admin delete one, several, or all transaction records. Select rows in the table — or click Select All — then click Delete Selected.</w:t>
       </w:r>
     </w:p>
     <w:p>
@@ -2856,7 +2856,7 @@
       </w:pPr>
       <w:r>
         <w:rPr/>
-        <w:t>This action is permanent and cannot be undone. It requires the admin password and a second confirmation prompt.</w:t>
+        <w:t>Deletion is permanent and cannot be undone. Before deleting, the dialog offers to export the selected records to an Excel archive file first (checkbox, on by default), and requires the admin password plus a final confirmation.</w:t>
       </w:r>
     </w:p>
     <w:p>
@@ -2874,7 +2874,7 @@
       </w:pPr>
       <w:r>
         <w:rPr/>
-        <w:t>Click the red Clear All Records button in the Server App window.</w:t>
+        <w:t>Click the Manage / Delete Records button in the Server App window, select the records (or Select All), then click Delete Selected.</w:t>
       </w:r>
     </w:p>
     <w:p>

</xml_diff>

<commit_message>
v1.5.0: dynamic engineer list (drop update-notification feature)
Reworks v1.5.0 to ship only the dynamic engineer list. The in-app update
notification feature (server /version + /download/installer, client version
checks) has been removed for now.

- Installer & Notifier load the engineer list from GET /members (with a ↻
  refresh button), falling back to the baked-in list if the server is
  unreachable — engineers added in the Storekeeper become selectable without
  rebuilding. Notifier setup dropdown is no longer locked to the baked list.
- Installer writes poll_interval: 15 (matches the app default).
- Docs updated accordingly.

Co-Authored-By: Claude Opus 4.8 <noreply@anthropic.com>
</commit_message>
<xml_diff>
--- a/AssetManager_Technical_Documentation.docx
+++ b/AssetManager_Technical_Documentation.docx
@@ -5741,21 +5741,6 @@
         <w:spacing w:before="160" w:after="0"/>
       </w:pPr>
     </w:p>
-    <w:p>
-      <w:r>
-        <w:t>Software Updates &amp; Versioning</w:t>
-      </w:r>
-    </w:p>
-    <w:p>
-      <w:r>
-        <w:t>Each app carries an APP_VERSION. The server exposes GET /version (latest version plus an installer download link) and GET /download/installer (serves AssetManager_Setup.exe when it is placed next to AssetServer.exe). On launch the Storekeeper and Notifier apps compare their APP_VERSION against the server; if they are behind, the user is prompted to download and run the installer. Only the version check runs automatically — the installer is downloaded via the browser on user action.</w:t>
-      </w:r>
-    </w:p>
-    <w:p>
-      <w:r>
-        <w:t>To publish an update: bump APP_VERSION, rebuild, deploy the new AssetServer.exe, and drop the new AssetManager_Setup.exe next to it. The installer and the Notifier load the engineer list from GET /members, so engineers added in the Storekeeper become selectable without rebuilding.</w:t>
-      </w:r>
-    </w:p>
     <w:sectPr>
       <w:headerReference w:type="default" r:id="rId9"/>
       <w:footerReference w:type="default" r:id="rId10"/>

</xml_diff>

<commit_message>
v1.6.0: docs for in-app update notifications
Technical Documentation + User Manual: added a Software Updates section
describing /version, /download/installer, and the update-on-launch prompt.

Co-Authored-By: Claude Opus 4.8 <noreply@anthropic.com>
</commit_message>
<xml_diff>
--- a/AssetManager_Technical_Documentation.docx
+++ b/AssetManager_Technical_Documentation.docx
@@ -5741,6 +5741,21 @@
         <w:spacing w:before="160" w:after="0"/>
       </w:pPr>
     </w:p>
+    <w:p>
+      <w:r>
+        <w:t>Software Updates &amp; Versioning</w:t>
+      </w:r>
+    </w:p>
+    <w:p>
+      <w:r>
+        <w:t>Each app carries an APP_VERSION. The server exposes GET /version (latest version plus an installer download link) and GET /download/installer (serves AssetManager_Setup.exe when it is placed next to AssetServer.exe). On launch the Storekeeper and Notifier compare their APP_VERSION against the server; if they are behind, the user is prompted to download and run the installer. Only the version check runs automatically — the installer is downloaded via the browser on user action.</w:t>
+      </w:r>
+    </w:p>
+    <w:p>
+      <w:r>
+        <w:t>To publish an update: bump APP_VERSION, rebuild, deploy the new AssetServer.exe, and drop the new AssetManager_Setup.exe next to it, then restart the server.</w:t>
+      </w:r>
+    </w:p>
     <w:sectPr>
       <w:headerReference w:type="default" r:id="rId9"/>
       <w:footerReference w:type="default" r:id="rId10"/>

</xml_diff>

<commit_message>
v1.6.0 docs: postpone limit + Check for Updates
Technical Documentation + User Manual: Software Updates section now notes the
5-postpone-then-forced limit, the manual Check for Updates, and the version
display in both apps.

Co-Authored-By: Claude Opus 4.8 <noreply@anthropic.com>
</commit_message>
<xml_diff>
--- a/AssetManager_Technical_Documentation.docx
+++ b/AssetManager_Technical_Documentation.docx
@@ -5756,6 +5756,11 @@
         <w:t>To publish an update: bump APP_VERSION, rebuild, deploy the new AssetServer.exe, and drop the new AssetManager_Setup.exe next to it, then restart the server.</w:t>
       </w:r>
     </w:p>
+    <w:p>
+      <w:r>
+        <w:t>The update prompt allows 5 postpones (tracked per version in update_state.json); on the 6th launch it becomes required and, after downloading, closes the app. Both apps also offer a manual Check for Updates (Storekeeper: history header; Notifier: tray menu) and display the current version (Storekeeper window title; Notifier tray).</w:t>
+      </w:r>
+    </w:p>
     <w:sectPr>
       <w:headerReference w:type="default" r:id="rId9"/>
       <w:footerReference w:type="default" r:id="rId10"/>

</xml_diff>

<commit_message>
v1.6.0 docs: note the threaded=True server concurrency fix
Technical Documentation: added a Server concurrency note explaining that the
server runs Flask in threaded mode so one stuck client can't block the others.

Co-Authored-By: Claude Opus 4.8 <noreply@anthropic.com>
</commit_message>
<xml_diff>
--- a/AssetManager_Technical_Documentation.docx
+++ b/AssetManager_Technical_Documentation.docx
@@ -5761,6 +5761,11 @@
         <w:t>The update prompt allows 5 postpones (tracked per version in update_state.json); on the 6th launch it becomes required and, after downloading, closes the app. Both apps also offer a manual Check for Updates (Storekeeper: history header; Notifier: tray menu) and display the current version (Storekeeper window title; Notifier tray).</w:t>
       </w:r>
     </w:p>
+    <w:p>
+      <w:r>
+        <w:t>Server concurrency: the server runs Flask in threaded mode (app.run(threaded=True)) so several Notifiers and the Storekeeper are served at once. Without it the server is single-threaded — one stuck or slow connection (e.g., a sleeping client or a brief database lock) can block every client until AssetServer.exe is restarted, even though the process is still running.</w:t>
+      </w:r>
+    </w:p>
     <w:sectPr>
       <w:headerReference w:type="default" r:id="rId9"/>
       <w:footerReference w:type="default" r:id="rId10"/>

</xml_diff>

<commit_message>
v1.6.1: Notifier shows bulk-scan popups one at a time
During a bulk scan the Notifier opened a separate always-on-top popup for
every pending transaction at once, so they stacked and flashed and the
engineer had no time to review each one.

- Notifier now queues pending transactions and shows ONE popup at a time; the
  next appears only after the current is confirmed/rejected. Each popup shows
  "N more waiting".
- APP_VERSION bumped to 1.6.1 across server/storekeeper/notifier/installer so
  deployed v1.6.0 clients are prompted to update.
- Docs/manuals updated.

Co-Authored-By: Claude Opus 4.8 <noreply@anthropic.com>
</commit_message>
<xml_diff>
--- a/AssetManager_Technical_Documentation.docx
+++ b/AssetManager_Technical_Documentation.docx
@@ -5766,6 +5766,11 @@
         <w:t>Server concurrency: the server runs Flask in threaded mode (app.run(threaded=True)) so several Notifiers and the Storekeeper are served at once. Without it the server is single-threaded — one stuck or slow connection (e.g., a sleeping client or a brief database lock) can block every client until AssetServer.exe is restarted, even though the process is still running.</w:t>
       </w:r>
     </w:p>
+    <w:p>
+      <w:r>
+        <w:t>Notifier popups are queued and shown one at a time (v1.6.1): the next popup appears only after the current one is confirmed or rejected, so a bulk scan does not stack or flash multiple windows.</w:t>
+      </w:r>
+    </w:p>
     <w:sectPr>
       <w:headerReference w:type="default" r:id="rId9"/>
       <w:footerReference w:type="default" r:id="rId10"/>

</xml_diff>